<commit_message>
Link Salmon Domain Ontology mentions to canonical repo
</commit_message>
<xml_diff>
--- a/docs/index.docx
+++ b/docs/index.docx
@@ -1009,7 +1009,7 @@
       </w:r>
     </w:p>
     <w:bookmarkEnd w:id="34"/>
-    <w:bookmarkStart w:id="50" w:name="Xd59215525a6daec1413c2c94b2fd89cbb47b38e"/>
+    <w:bookmarkStart w:id="51" w:name="Xd59215525a6daec1413c2c94b2fd89cbb47b38e"/>
     <w:p>
       <w:pPr>
         <w:pStyle w:val="Heading2"/>
@@ -1226,7 +1226,7 @@
       </w:r>
     </w:p>
     <w:bookmarkEnd w:id="36"/>
-    <w:bookmarkStart w:id="49" w:name="X016975eebbe11d595ff9a60c9dddc661908a3e3"/>
+    <w:bookmarkStart w:id="50" w:name="X016975eebbe11d595ff9a60c9dddc661908a3e3"/>
     <w:p>
       <w:pPr>
         <w:pStyle w:val="Heading3"/>
@@ -1471,7 +1471,7 @@
       <w:tr>
         <w:tc>
           <w:tcPr/>
-          <w:bookmarkStart w:id="42" w:name="tbl-bestpractices"/>
+          <w:bookmarkStart w:id="43" w:name="tbl-bestpractices"/>
           <w:p>
             <w:pPr>
               <w:jc w:val="center"/>
@@ -1685,7 +1685,21 @@
                     <w:t xml:space="preserve">• Adopt ISO 19115, EML, or DataCite metadata standards.</w:t>
                   </w:r>
                   <w:r>
-                    <w:t xml:space="preserve">• Re-use terms defined in Salmon Domain Ontology.</w:t>
+                    <w:t xml:space="preserve">• Re-use terms defined in</w:t>
+                  </w:r>
+                  <w:r>
+                    <w:t xml:space="preserve"> </w:t>
+                  </w:r>
+                  <w:hyperlink r:id="rId42">
+                    <w:r>
+                      <w:rPr>
+                        <w:rStyle w:val="Hyperlink"/>
+                      </w:rPr>
+                      <w:t xml:space="preserve">Salmon Domain Ontology</w:t>
+                    </w:r>
+                  </w:hyperlink>
+                  <w:r>
+                    <w:t xml:space="preserve">.</w:t>
                   </w:r>
                   <w:r>
                     <w:t xml:space="preserve">• Model datasets using the Darwin Core Data Package model.</w:t>
@@ -1826,7 +1840,7 @@
               </w:tc>
             </w:tr>
           </w:tbl>
-          <w:bookmarkEnd w:id="42"/>
+          <w:bookmarkEnd w:id="43"/>
           <w:p/>
         </w:tc>
       </w:tr>
@@ -1880,12 +1894,12 @@
                 <wp:inline>
                   <wp:extent cx="152400" cy="152400"/>
                   <wp:effectExtent b="0" l="0" r="0" t="0"/>
-                  <wp:docPr descr="" title="" id="43" name="Picture"/>
+                  <wp:docPr descr="" title="" id="44" name="Picture"/>
                   <a:graphic>
                     <a:graphicData uri="http://schemas.openxmlformats.org/drawingml/2006/picture">
                       <pic:pic>
                         <pic:nvPicPr>
-                          <pic:cNvPr descr="/Users/alan/.local/opt/quarto-1.8.27/share/formats/docx/note.png" id="44" name="Picture"/>
+                          <pic:cNvPr descr="/Users/alan/.local/opt/quarto-1.8.27/share/formats/docx/note.png" id="45" name="Picture"/>
                           <pic:cNvPicPr>
                             <a:picLocks noChangeArrowheads="1" noChangeAspect="1"/>
                           </pic:cNvPicPr>
@@ -1986,7 +2000,7 @@
             <w:r>
               <w:t xml:space="preserve">(</w:t>
             </w:r>
-            <w:hyperlink r:id="rId45">
+            <w:hyperlink r:id="rId46">
               <w:r>
                 <w:rPr>
                   <w:rStyle w:val="Hyperlink"/>
@@ -2025,7 +2039,7 @@
             <w:r>
               <w:t xml:space="preserve">(</w:t>
             </w:r>
-            <w:hyperlink r:id="rId46">
+            <w:hyperlink r:id="rId47">
               <w:r>
                 <w:rPr>
                   <w:rStyle w:val="Hyperlink"/>
@@ -2045,13 +2059,16 @@
                 <w:numId w:val="1006"/>
               </w:numPr>
             </w:pPr>
-            <w:r>
-              <w:rPr>
-                <w:b/>
-                <w:bCs/>
-              </w:rPr>
-              <w:t xml:space="preserve">Salmon Domain Ontology</w:t>
-            </w:r>
+            <w:hyperlink r:id="rId42">
+              <w:r>
+                <w:rPr>
+                  <w:rStyle w:val="Hyperlink"/>
+                  <w:b/>
+                  <w:bCs/>
+                </w:rPr>
+                <w:t xml:space="preserve">Salmon Domain Ontology</w:t>
+              </w:r>
+            </w:hyperlink>
             <w:r>
               <w:t xml:space="preserve"> </w:t>
             </w:r>
@@ -2086,7 +2103,7 @@
             <w:r>
               <w:t xml:space="preserve">(</w:t>
             </w:r>
-            <w:hyperlink r:id="rId47">
+            <w:hyperlink r:id="rId48">
               <w:r>
                 <w:rPr>
                   <w:rStyle w:val="Hyperlink"/>
@@ -2095,7 +2112,24 @@
               </w:r>
             </w:hyperlink>
             <w:r>
-              <w:t xml:space="preserve">) (organization-specific ontology and controlled vocabularies aligned to the broader Salmon Domain Ontology layer)</w:t>
+              <w:t xml:space="preserve">) (organization-specific ontology and controlled vocabularies aligned to the broader</w:t>
+            </w:r>
+            <w:r>
+              <w:t xml:space="preserve"> </w:t>
+            </w:r>
+            <w:hyperlink r:id="rId42">
+              <w:r>
+                <w:rPr>
+                  <w:rStyle w:val="Hyperlink"/>
+                </w:rPr>
+                <w:t xml:space="preserve">Salmon Domain Ontology</w:t>
+              </w:r>
+            </w:hyperlink>
+            <w:r>
+              <w:t xml:space="preserve"> </w:t>
+            </w:r>
+            <w:r>
+              <w:t xml:space="preserve">layer)</w:t>
             </w:r>
           </w:p>
           <w:p>
@@ -2125,7 +2159,7 @@
             <w:r>
               <w:t xml:space="preserve">(</w:t>
             </w:r>
-            <w:hyperlink r:id="rId48">
+            <w:hyperlink r:id="rId49">
               <w:r>
                 <w:rPr>
                   <w:rStyle w:val="Hyperlink"/>
@@ -2177,9 +2211,9 @@
         <w:t xml:space="preserve">For teams that use lifecycle framing, these practices operate across the full data lifecycle, with metadata governance treated as a continuous cross-cutting function rather than a separate step.</w:t>
       </w:r>
     </w:p>
-    <w:bookmarkEnd w:id="49"/>
     <w:bookmarkEnd w:id="50"/>
-    <w:bookmarkStart w:id="131" w:name="conclusion"/>
+    <w:bookmarkEnd w:id="51"/>
+    <w:bookmarkStart w:id="132" w:name="conclusion"/>
     <w:p>
       <w:pPr>
         <w:pStyle w:val="Heading2"/>
@@ -2284,7 +2318,7 @@
         <w:t xml:space="preserve">, institutionalizing data stewardship roles ensures long-term capacity for data governance, quality control, and interoperability—functions that are often neglected or left to informal actors. We should not only train new data stewards but also support and upskill biologists to take on stewardship responsibilities in collaborative, interdisciplinary settings. This is essential to address the data technical debt of unmanaged data and to modernize research practices in line with open science norms. By embedding these practices into the everyday work of data generation, documentation, publication, and reuse, we can move salmon science decisively into the era of data-intensive discovery.</w:t>
       </w:r>
     </w:p>
-    <w:bookmarkStart w:id="51" w:name="acknowledgements"/>
+    <w:bookmarkStart w:id="52" w:name="acknowledgements"/>
     <w:p>
       <w:pPr>
         <w:pStyle w:val="Heading3"/>
@@ -2301,8 +2335,8 @@
         <w:t xml:space="preserve">We thank collaborators and practitioners from Fisheries and Oceans Canada, the Pacific Salmon Foundation, the Pacific States Marine Fisheries Commission, and the broader salmon data community for constructive feedback and for sharing practical examples that informed this manuscript.</w:t>
       </w:r>
     </w:p>
-    <w:bookmarkEnd w:id="51"/>
-    <w:bookmarkStart w:id="52" w:name="data-availability"/>
+    <w:bookmarkEnd w:id="52"/>
+    <w:bookmarkStart w:id="53" w:name="data-availability"/>
     <w:p>
       <w:pPr>
         <w:pStyle w:val="Heading3"/>
@@ -2319,8 +2353,8 @@
         <w:t xml:space="preserve">This manuscript is a synthesis and does not report a newly generated primary dataset. Datasets referenced as examples are available through the cited repositories, landing pages, and DOIs in the text and appendices.</w:t>
       </w:r>
     </w:p>
-    <w:bookmarkEnd w:id="52"/>
-    <w:bookmarkStart w:id="53" w:name="code-availability"/>
+    <w:bookmarkEnd w:id="53"/>
+    <w:bookmarkStart w:id="54" w:name="code-availability"/>
     <w:p>
       <w:pPr>
         <w:pStyle w:val="Heading3"/>
@@ -2337,8 +2371,8 @@
         <w:t xml:space="preserve">No new software was developed specifically for this manuscript. Code resources discussed as examples are available at the cited public repositories and archival records.</w:t>
       </w:r>
     </w:p>
-    <w:bookmarkEnd w:id="53"/>
-    <w:bookmarkStart w:id="54" w:name="conflicts-of-interest"/>
+    <w:bookmarkEnd w:id="54"/>
+    <w:bookmarkStart w:id="55" w:name="conflicts-of-interest"/>
     <w:p>
       <w:pPr>
         <w:pStyle w:val="Heading3"/>
@@ -2355,8 +2389,8 @@
         <w:t xml:space="preserve">None declared.</w:t>
       </w:r>
     </w:p>
-    <w:bookmarkEnd w:id="54"/>
-    <w:bookmarkStart w:id="55" w:name="ethics-statement"/>
+    <w:bookmarkEnd w:id="55"/>
+    <w:bookmarkStart w:id="56" w:name="ethics-statement"/>
     <w:p>
       <w:pPr>
         <w:pStyle w:val="Heading3"/>
@@ -2373,8 +2407,8 @@
         <w:t xml:space="preserve">This manuscript does not involve primary research with human or animal subjects. All cited research was conducted in accordance with applicable ethical guidelines and legal requirements of the jurisdictions in which the studies were performed.</w:t>
       </w:r>
     </w:p>
-    <w:bookmarkEnd w:id="55"/>
-    <w:bookmarkStart w:id="56" w:name="funding"/>
+    <w:bookmarkEnd w:id="56"/>
+    <w:bookmarkStart w:id="57" w:name="funding"/>
     <w:p>
       <w:pPr>
         <w:pStyle w:val="Heading3"/>
@@ -2391,8 +2425,8 @@
         <w:t xml:space="preserve">This work was supported in part by the Pacific Salmon Foundation and Fisheries and Oceans Canada.</w:t>
       </w:r>
     </w:p>
-    <w:bookmarkEnd w:id="56"/>
-    <w:bookmarkStart w:id="130" w:name="references"/>
+    <w:bookmarkEnd w:id="57"/>
+    <w:bookmarkStart w:id="131" w:name="references"/>
     <w:p>
       <w:pPr>
         <w:pStyle w:val="Heading3"/>
@@ -2401,8 +2435,8 @@
         <w:t xml:space="preserve">References</w:t>
       </w:r>
     </w:p>
-    <w:bookmarkStart w:id="129" w:name="refs"/>
-    <w:bookmarkStart w:id="58" w:name="Xc7d78bce84bdade13c6e18f8b678ebae5c0ba8e"/>
+    <w:bookmarkStart w:id="130" w:name="refs"/>
+    <w:bookmarkStart w:id="59" w:name="Xc7d78bce84bdade13c6e18f8b678ebae5c0ba8e"/>
     <w:p>
       <w:pPr>
         <w:pStyle w:val="Bibliography"/>
@@ -2439,7 +2473,7 @@
       <w:r>
         <w:t xml:space="preserve"> </w:t>
       </w:r>
-      <w:hyperlink r:id="rId57">
+      <w:hyperlink r:id="rId58">
         <w:r>
           <w:rPr>
             <w:rStyle w:val="Hyperlink"/>
@@ -2448,8 +2482,8 @@
         </w:r>
       </w:hyperlink>
     </w:p>
-    <w:bookmarkEnd w:id="58"/>
-    <w:bookmarkStart w:id="60" w:name="ref-bull2022"/>
+    <w:bookmarkEnd w:id="59"/>
+    <w:bookmarkStart w:id="61" w:name="ref-bull2022"/>
     <w:p>
       <w:pPr>
         <w:pStyle w:val="Bibliography"/>
@@ -2496,7 +2530,7 @@
       <w:r>
         <w:t xml:space="preserve"> </w:t>
       </w:r>
-      <w:hyperlink r:id="rId59">
+      <w:hyperlink r:id="rId60">
         <w:r>
           <w:rPr>
             <w:rStyle w:val="Hyperlink"/>
@@ -2505,8 +2539,8 @@
         </w:r>
       </w:hyperlink>
     </w:p>
-    <w:bookmarkEnd w:id="60"/>
-    <w:bookmarkStart w:id="62" w:name="ref-carroll2020"/>
+    <w:bookmarkEnd w:id="61"/>
+    <w:bookmarkStart w:id="63" w:name="ref-carroll2020"/>
     <w:p>
       <w:pPr>
         <w:pStyle w:val="Bibliography"/>
@@ -2543,7 +2577,7 @@
       <w:r>
         <w:t xml:space="preserve"> </w:t>
       </w:r>
-      <w:hyperlink r:id="rId61">
+      <w:hyperlink r:id="rId62">
         <w:r>
           <w:rPr>
             <w:rStyle w:val="Hyperlink"/>
@@ -2552,8 +2586,8 @@
         </w:r>
       </w:hyperlink>
     </w:p>
-    <w:bookmarkEnd w:id="62"/>
-    <w:bookmarkStart w:id="64" w:name="X33d136e394f813e1a6591bd6e510ca682cbbb68"/>
+    <w:bookmarkEnd w:id="63"/>
+    <w:bookmarkStart w:id="65" w:name="X33d136e394f813e1a6591bd6e510ca682cbbb68"/>
     <w:p>
       <w:pPr>
         <w:pStyle w:val="Bibliography"/>
@@ -2577,7 +2611,7 @@
       <w:r>
         <w:t xml:space="preserve"> </w:t>
       </w:r>
-      <w:hyperlink r:id="rId63">
+      <w:hyperlink r:id="rId64">
         <w:r>
           <w:rPr>
             <w:rStyle w:val="Hyperlink"/>
@@ -2586,8 +2620,8 @@
         </w:r>
       </w:hyperlink>
     </w:p>
-    <w:bookmarkEnd w:id="64"/>
-    <w:bookmarkStart w:id="66" w:name="ref-carroll2019"/>
+    <w:bookmarkEnd w:id="65"/>
+    <w:bookmarkStart w:id="67" w:name="ref-carroll2019"/>
     <w:p>
       <w:pPr>
         <w:pStyle w:val="Bibliography"/>
@@ -2624,7 +2658,7 @@
       <w:r>
         <w:t xml:space="preserve"> </w:t>
       </w:r>
-      <w:hyperlink r:id="rId65">
+      <w:hyperlink r:id="rId66">
         <w:r>
           <w:rPr>
             <w:rStyle w:val="Hyperlink"/>
@@ -2633,8 +2667,8 @@
         </w:r>
       </w:hyperlink>
     </w:p>
-    <w:bookmarkEnd w:id="66"/>
-    <w:bookmarkStart w:id="68" w:name="Xc8a8b3ec5c49488c2d1ce220591d851da5c345d"/>
+    <w:bookmarkEnd w:id="67"/>
+    <w:bookmarkStart w:id="69" w:name="Xc8a8b3ec5c49488c2d1ce220591d851da5c345d"/>
     <w:p>
       <w:pPr>
         <w:pStyle w:val="Bibliography"/>
@@ -2658,7 +2692,7 @@
       <w:r>
         <w:t xml:space="preserve"> </w:t>
       </w:r>
-      <w:hyperlink r:id="rId67">
+      <w:hyperlink r:id="rId68">
         <w:r>
           <w:rPr>
             <w:rStyle w:val="Hyperlink"/>
@@ -2667,8 +2701,8 @@
         </w:r>
       </w:hyperlink>
     </w:p>
-    <w:bookmarkEnd w:id="68"/>
-    <w:bookmarkStart w:id="70" w:name="ref-coretrustseal_2022_requirements"/>
+    <w:bookmarkEnd w:id="69"/>
+    <w:bookmarkStart w:id="71" w:name="ref-coretrustseal_2022_requirements"/>
     <w:p>
       <w:pPr>
         <w:pStyle w:val="Bibliography"/>
@@ -2692,7 +2726,7 @@
       <w:r>
         <w:t xml:space="preserve"> </w:t>
       </w:r>
-      <w:hyperlink r:id="rId69">
+      <w:hyperlink r:id="rId70">
         <w:r>
           <w:rPr>
             <w:rStyle w:val="Hyperlink"/>
@@ -2701,8 +2735,8 @@
         </w:r>
       </w:hyperlink>
     </w:p>
-    <w:bookmarkEnd w:id="70"/>
-    <w:bookmarkStart w:id="71" w:name="ref-dfo_salmon_ontology"/>
+    <w:bookmarkEnd w:id="71"/>
+    <w:bookmarkStart w:id="72" w:name="ref-dfo_salmon_ontology"/>
     <w:p>
       <w:pPr>
         <w:pStyle w:val="Bibliography"/>
@@ -2726,33 +2760,108 @@
       <w:r>
         <w:t xml:space="preserve"> </w:t>
       </w:r>
+      <w:hyperlink r:id="rId48">
+        <w:r>
+          <w:rPr>
+            <w:rStyle w:val="Hyperlink"/>
+          </w:rPr>
+          <w:t xml:space="preserve">https://dfo-pacific-science.github.io/dfo-salmon-ontology/</w:t>
+        </w:r>
+      </w:hyperlink>
+    </w:p>
+    <w:bookmarkEnd w:id="72"/>
+    <w:bookmarkStart w:id="73" w:name="ref-metasalmon"/>
+    <w:p>
+      <w:pPr>
+        <w:pStyle w:val="Bibliography"/>
+      </w:pPr>
+      <w:r>
+        <w:t xml:space="preserve">DFO Pacific Science. (2026b).</w:t>
+      </w:r>
+      <w:r>
+        <w:t xml:space="preserve"> </w:t>
+      </w:r>
+      <w:r>
+        <w:rPr>
+          <w:i/>
+          <w:iCs/>
+        </w:rPr>
+        <w:t xml:space="preserve">Metasalmon (r): Tools for salmon data packaging and validation</w:t>
+      </w:r>
+      <w:r>
+        <w:t xml:space="preserve">.</w:t>
+      </w:r>
+      <w:r>
+        <w:t xml:space="preserve"> </w:t>
+      </w:r>
+      <w:hyperlink r:id="rId46">
+        <w:r>
+          <w:rPr>
+            <w:rStyle w:val="Hyperlink"/>
+          </w:rPr>
+          <w:t xml:space="preserve">https://dfo-pacific-science.github.io/metasalmon/index.html</w:t>
+        </w:r>
+      </w:hyperlink>
+    </w:p>
+    <w:bookmarkEnd w:id="73"/>
+    <w:bookmarkStart w:id="74" w:name="ref-smn_data_pkg_spec"/>
+    <w:p>
+      <w:pPr>
+        <w:pStyle w:val="Bibliography"/>
+      </w:pPr>
+      <w:r>
+        <w:t xml:space="preserve">DFO Pacific Science. (2026c).</w:t>
+      </w:r>
+      <w:r>
+        <w:t xml:space="preserve"> </w:t>
+      </w:r>
+      <w:r>
+        <w:rPr>
+          <w:i/>
+          <w:iCs/>
+        </w:rPr>
+        <w:t xml:space="preserve">Salmon Data Package</w:t>
+      </w:r>
+      <w:r>
+        <w:rPr>
+          <w:i/>
+          <w:iCs/>
+        </w:rPr>
+        <w:t xml:space="preserve">: specification</w:t>
+      </w:r>
+      <w:r>
+        <w:t xml:space="preserve">.</w:t>
+      </w:r>
+      <w:r>
+        <w:t xml:space="preserve"> </w:t>
+      </w:r>
       <w:hyperlink r:id="rId47">
         <w:r>
           <w:rPr>
             <w:rStyle w:val="Hyperlink"/>
           </w:rPr>
-          <w:t xml:space="preserve">https://dfo-pacific-science.github.io/dfo-salmon-ontology/</w:t>
-        </w:r>
-      </w:hyperlink>
-    </w:p>
-    <w:bookmarkEnd w:id="71"/>
-    <w:bookmarkStart w:id="72" w:name="ref-metasalmon"/>
+          <w:t xml:space="preserve">https://github.com/dfo-pacific-science/smn-data-pkg/blob/main/SPECIFICATION.md</w:t>
+        </w:r>
+      </w:hyperlink>
+    </w:p>
+    <w:bookmarkEnd w:id="74"/>
+    <w:bookmarkStart w:id="75" w:name="ref-smn_gpt"/>
     <w:p>
       <w:pPr>
         <w:pStyle w:val="Bibliography"/>
       </w:pPr>
       <w:r>
-        <w:t xml:space="preserve">DFO Pacific Science. (2026b).</w:t>
-      </w:r>
-      <w:r>
-        <w:t xml:space="preserve"> </w:t>
-      </w:r>
-      <w:r>
-        <w:rPr>
-          <w:i/>
-          <w:iCs/>
-        </w:rPr>
-        <w:t xml:space="preserve">Metasalmon (r): Tools for salmon data packaging and validation</w:t>
+        <w:t xml:space="preserve">DFO Pacific Science. (2026d).</w:t>
+      </w:r>
+      <w:r>
+        <w:t xml:space="preserve"> </w:t>
+      </w:r>
+      <w:r>
+        <w:rPr>
+          <w:i/>
+          <w:iCs/>
+        </w:rPr>
+        <w:t xml:space="preserve">SMN GPT (salmon data GPT)</w:t>
       </w:r>
       <w:r>
         <w:t xml:space="preserve">.</w:t>
@@ -2760,40 +2869,33 @@
       <w:r>
         <w:t xml:space="preserve"> </w:t>
       </w:r>
-      <w:hyperlink r:id="rId45">
-        <w:r>
-          <w:rPr>
-            <w:rStyle w:val="Hyperlink"/>
-          </w:rPr>
-          <w:t xml:space="preserve">https://dfo-pacific-science.github.io/metasalmon/index.html</w:t>
-        </w:r>
-      </w:hyperlink>
-    </w:p>
-    <w:bookmarkEnd w:id="72"/>
-    <w:bookmarkStart w:id="73" w:name="ref-smn_data_pkg_spec"/>
+      <w:hyperlink r:id="rId49">
+        <w:r>
+          <w:rPr>
+            <w:rStyle w:val="Hyperlink"/>
+          </w:rPr>
+          <w:t xml:space="preserve">https://github.com/dfo-pacific-science/smn-gpt</w:t>
+        </w:r>
+      </w:hyperlink>
+    </w:p>
+    <w:bookmarkEnd w:id="75"/>
+    <w:bookmarkStart w:id="77" w:name="ref-diack2024"/>
     <w:p>
       <w:pPr>
         <w:pStyle w:val="Bibliography"/>
       </w:pPr>
       <w:r>
-        <w:t xml:space="preserve">DFO Pacific Science. (2026c).</w:t>
-      </w:r>
-      <w:r>
-        <w:t xml:space="preserve"> </w:t>
-      </w:r>
-      <w:r>
-        <w:rPr>
-          <w:i/>
-          <w:iCs/>
-        </w:rPr>
-        <w:t xml:space="preserve">Salmon Data Package</w:t>
-      </w:r>
-      <w:r>
-        <w:rPr>
-          <w:i/>
-          <w:iCs/>
-        </w:rPr>
-        <w:t xml:space="preserve">: specification</w:t>
+        <w:t xml:space="preserve">Diack, G., Bird, T., Akenhead, S., Bayer, J., Brophy, D., Bull, C., Eyto, E. de, Johnson, B., Jones, M., Knight, A., Nevoux, M., Stap, T. van der, &amp; Walker, A. (2024). Salmon data mobilization.</w:t>
+      </w:r>
+      <w:r>
+        <w:t xml:space="preserve"> </w:t>
+      </w:r>
+      <w:r>
+        <w:rPr>
+          <w:i/>
+          <w:iCs/>
+        </w:rPr>
+        <w:t xml:space="preserve">North Pacific Anadromous Fish Commission Bulletin</w:t>
       </w:r>
       <w:r>
         <w:t xml:space="preserve">.</w:t>
@@ -2801,33 +2903,361 @@
       <w:r>
         <w:t xml:space="preserve"> </w:t>
       </w:r>
-      <w:hyperlink r:id="rId46">
-        <w:r>
-          <w:rPr>
-            <w:rStyle w:val="Hyperlink"/>
-          </w:rPr>
-          <w:t xml:space="preserve">https://github.com/dfo-pacific-science/smn-data-pkg/blob/main/SPECIFICATION.md</w:t>
-        </w:r>
-      </w:hyperlink>
-    </w:p>
-    <w:bookmarkEnd w:id="73"/>
-    <w:bookmarkStart w:id="74" w:name="ref-smn_gpt"/>
+      <w:hyperlink r:id="rId76">
+        <w:r>
+          <w:rPr>
+            <w:rStyle w:val="Hyperlink"/>
+          </w:rPr>
+          <w:t xml:space="preserve">https://doi.org/10.23849/npafcb7/x3rlpo23a</w:t>
+        </w:r>
+      </w:hyperlink>
+    </w:p>
+    <w:bookmarkEnd w:id="77"/>
+    <w:bookmarkStart w:id="79" w:name="ref-eartheconomics2021"/>
     <w:p>
       <w:pPr>
         <w:pStyle w:val="Bibliography"/>
       </w:pPr>
       <w:r>
-        <w:t xml:space="preserve">DFO Pacific Science. (2026d).</w:t>
-      </w:r>
-      <w:r>
-        <w:t xml:space="preserve"> </w:t>
-      </w:r>
-      <w:r>
-        <w:rPr>
-          <w:i/>
-          <w:iCs/>
-        </w:rPr>
-        <w:t xml:space="preserve">SMN GPT (salmon data GPT)</w:t>
+        <w:t xml:space="preserve">Earth Economics. (2021).</w:t>
+      </w:r>
+      <w:r>
+        <w:t xml:space="preserve"> </w:t>
+      </w:r>
+      <w:r>
+        <w:rPr>
+          <w:i/>
+          <w:iCs/>
+        </w:rPr>
+        <w:t xml:space="preserve">The Sociocultural Significance of Pacific Salmon to Tribes and First Nations</w:t>
+      </w:r>
+      <w:r>
+        <w:t xml:space="preserve"> </w:t>
+      </w:r>
+      <w:r>
+        <w:t xml:space="preserve">(p. 73).</w:t>
+      </w:r>
+      <w:r>
+        <w:t xml:space="preserve"> </w:t>
+      </w:r>
+      <w:hyperlink r:id="rId78">
+        <w:r>
+          <w:rPr>
+            <w:rStyle w:val="Hyperlink"/>
+          </w:rPr>
+          <w:t xml:space="preserve">https://www.psc.org/wp-content/uploads/wpfd/preview_files/The-Sociocultural-Significance-of-Salmon-to-Tribes-and-First-Nations(5da9942da9fb4fe0d77eb32bd6165e43).pdf</w:t>
+        </w:r>
+      </w:hyperlink>
+    </w:p>
+    <w:bookmarkEnd w:id="79"/>
+    <w:bookmarkStart w:id="81" w:name="ref-noauthor_fraser_2025"/>
+    <w:p>
+      <w:pPr>
+        <w:pStyle w:val="Bibliography"/>
+      </w:pPr>
+      <w:r>
+        <w:rPr>
+          <w:i/>
+          <w:iCs/>
+        </w:rPr>
+        <w:t xml:space="preserve">Fraser</w:t>
+      </w:r>
+      <w:r>
+        <w:rPr>
+          <w:i/>
+          <w:iCs/>
+        </w:rPr>
+        <w:t xml:space="preserve"> </w:t>
+      </w:r>
+      <w:r>
+        <w:rPr>
+          <w:i/>
+          <w:iCs/>
+        </w:rPr>
+        <w:t xml:space="preserve">River</w:t>
+      </w:r>
+      <w:r>
+        <w:rPr>
+          <w:i/>
+          <w:iCs/>
+        </w:rPr>
+        <w:t xml:space="preserve"> </w:t>
+      </w:r>
+      <w:r>
+        <w:rPr>
+          <w:i/>
+          <w:iCs/>
+        </w:rPr>
+        <w:t xml:space="preserve">Panel</w:t>
+      </w:r>
+      <w:r>
+        <w:rPr>
+          <w:i/>
+          <w:iCs/>
+        </w:rPr>
+        <w:t xml:space="preserve"> </w:t>
+      </w:r>
+      <w:r>
+        <w:rPr>
+          <w:i/>
+          <w:iCs/>
+        </w:rPr>
+        <w:t xml:space="preserve">Data</w:t>
+      </w:r>
+      <w:r>
+        <w:rPr>
+          <w:i/>
+          <w:iCs/>
+        </w:rPr>
+        <w:t xml:space="preserve"> </w:t>
+      </w:r>
+      <w:r>
+        <w:rPr>
+          <w:i/>
+          <w:iCs/>
+        </w:rPr>
+        <w:t xml:space="preserve">Application</w:t>
+      </w:r>
+      <w:r>
+        <w:t xml:space="preserve">. (2025). Pacific Salmon Commission.</w:t>
+      </w:r>
+      <w:r>
+        <w:t xml:space="preserve"> </w:t>
+      </w:r>
+      <w:hyperlink r:id="rId80">
+        <w:r>
+          <w:rPr>
+            <w:rStyle w:val="Hyperlink"/>
+          </w:rPr>
+          <w:t xml:space="preserve">https://psc1.shinyapps.io/PSC_In_Season_Fraser/</w:t>
+        </w:r>
+      </w:hyperlink>
+    </w:p>
+    <w:bookmarkEnd w:id="81"/>
+    <w:bookmarkStart w:id="83" w:name="ref-gofair_a12_auth"/>
+    <w:p>
+      <w:pPr>
+        <w:pStyle w:val="Bibliography"/>
+      </w:pPr>
+      <w:r>
+        <w:t xml:space="preserve">GO FAIR Initiative. (n.d.).</w:t>
+      </w:r>
+      <w:r>
+        <w:t xml:space="preserve"> </w:t>
+      </w:r>
+      <w:r>
+        <w:rPr>
+          <w:i/>
+          <w:iCs/>
+        </w:rPr>
+        <w:t xml:space="preserve">A1.2: The protocol allows for an authentication and authorisation procedure, where necessary</w:t>
+      </w:r>
+      <w:r>
+        <w:t xml:space="preserve">. Web page.</w:t>
+      </w:r>
+      <w:r>
+        <w:t xml:space="preserve"> </w:t>
+      </w:r>
+      <w:hyperlink r:id="rId82">
+        <w:r>
+          <w:rPr>
+            <w:rStyle w:val="Hyperlink"/>
+          </w:rPr>
+          <w:t xml:space="preserve">https://www.go-fair.org/fair-principles/a1-2-protocol-allows-authentication-authorisation-required/</w:t>
+        </w:r>
+      </w:hyperlink>
+    </w:p>
+    <w:bookmarkEnd w:id="83"/>
+    <w:bookmarkStart w:id="85" w:name="ref-groot1991"/>
+    <w:p>
+      <w:pPr>
+        <w:pStyle w:val="Bibliography"/>
+      </w:pPr>
+      <w:r>
+        <w:t xml:space="preserve">Groot, C., &amp; Margolis, L. (1991).</w:t>
+      </w:r>
+      <w:r>
+        <w:t xml:space="preserve"> </w:t>
+      </w:r>
+      <w:r>
+        <w:rPr>
+          <w:i/>
+          <w:iCs/>
+        </w:rPr>
+        <w:t xml:space="preserve">Pacific Salmon Life Histories</w:t>
+      </w:r>
+      <w:r>
+        <w:t xml:space="preserve">. UBC Press.</w:t>
+      </w:r>
+      <w:r>
+        <w:t xml:space="preserve"> </w:t>
+      </w:r>
+      <w:hyperlink r:id="rId84">
+        <w:r>
+          <w:rPr>
+            <w:rStyle w:val="Hyperlink"/>
+          </w:rPr>
+          <w:t xml:space="preserve">https://books.google.ca/books?id=I_S0xCME0CYC</w:t>
+        </w:r>
+      </w:hyperlink>
+    </w:p>
+    <w:bookmarkEnd w:id="85"/>
+    <w:bookmarkStart w:id="87" w:name="ref-inman2021"/>
+    <w:p>
+      <w:pPr>
+        <w:pStyle w:val="Bibliography"/>
+      </w:pPr>
+      <w:r>
+        <w:t xml:space="preserve">Inman, S., Esquible, J., Jones, M., Bechtol, W., &amp; Connors, B. (2021). Opportunities and impediments for use of local data in the management of salmon fisheries.</w:t>
+      </w:r>
+      <w:r>
+        <w:t xml:space="preserve"> </w:t>
+      </w:r>
+      <w:r>
+        <w:rPr>
+          <w:i/>
+          <w:iCs/>
+        </w:rPr>
+        <w:t xml:space="preserve">Ecology and Society</w:t>
+      </w:r>
+      <w:r>
+        <w:t xml:space="preserve">,</w:t>
+      </w:r>
+      <w:r>
+        <w:t xml:space="preserve"> </w:t>
+      </w:r>
+      <w:r>
+        <w:rPr>
+          <w:i/>
+          <w:iCs/>
+        </w:rPr>
+        <w:t xml:space="preserve">26</w:t>
+      </w:r>
+      <w:r>
+        <w:t xml:space="preserve">(2).</w:t>
+      </w:r>
+      <w:r>
+        <w:t xml:space="preserve"> </w:t>
+      </w:r>
+      <w:hyperlink r:id="rId86">
+        <w:r>
+          <w:rPr>
+            <w:rStyle w:val="Hyperlink"/>
+          </w:rPr>
+          <w:t xml:space="preserve">https://doi.org/10.5751/ES-12117-260226</w:t>
+        </w:r>
+      </w:hyperlink>
+    </w:p>
+    <w:bookmarkEnd w:id="87"/>
+    <w:bookmarkStart w:id="89" w:name="ref-iso9241_210_2019"/>
+    <w:p>
+      <w:pPr>
+        <w:pStyle w:val="Bibliography"/>
+      </w:pPr>
+      <w:r>
+        <w:t xml:space="preserve">ISO</w:t>
+      </w:r>
+      <w:r>
+        <w:t xml:space="preserve"> </w:t>
+      </w:r>
+      <w:r>
+        <w:t xml:space="preserve">9241-210:2019 Ergonomics of Human-System Interaction – Part 210: Human-Centred Design for Interactive Systems (2019).</w:t>
+      </w:r>
+      <w:r>
+        <w:t xml:space="preserve"> </w:t>
+      </w:r>
+      <w:hyperlink r:id="rId88">
+        <w:r>
+          <w:rPr>
+            <w:rStyle w:val="Hyperlink"/>
+          </w:rPr>
+          <w:t xml:space="preserve">https://www.iso.org/standard/77520.html</w:t>
+        </w:r>
+      </w:hyperlink>
+    </w:p>
+    <w:bookmarkEnd w:id="89"/>
+    <w:bookmarkStart w:id="91" w:name="ref-jennings2023a"/>
+    <w:p>
+      <w:pPr>
+        <w:pStyle w:val="Bibliography"/>
+      </w:pPr>
+      <w:r>
+        <w:t xml:space="preserve">Jennings, L., Anderson, T., Martinez, A., Sterling, R., Chavez, D. D., Garba, I., Hudson, M., Garrison, N. A., &amp; Carroll, S. R. (2023). Applying the</w:t>
+      </w:r>
+      <w:r>
+        <w:t xml:space="preserve"> </w:t>
+      </w:r>
+      <w:r>
+        <w:t xml:space="preserve">‘</w:t>
+      </w:r>
+      <w:r>
+        <w:t xml:space="preserve">CARE Principles for Indigenous Data Governance</w:t>
+      </w:r>
+      <w:r>
+        <w:t xml:space="preserve">’</w:t>
+      </w:r>
+      <w:r>
+        <w:t xml:space="preserve"> </w:t>
+      </w:r>
+      <w:r>
+        <w:t xml:space="preserve">to ecology and biodiversity research.</w:t>
+      </w:r>
+      <w:r>
+        <w:t xml:space="preserve"> </w:t>
+      </w:r>
+      <w:r>
+        <w:rPr>
+          <w:i/>
+          <w:iCs/>
+        </w:rPr>
+        <w:t xml:space="preserve">Nature Ecology &amp; Evolution</w:t>
+      </w:r>
+      <w:r>
+        <w:t xml:space="preserve">,</w:t>
+      </w:r>
+      <w:r>
+        <w:t xml:space="preserve"> </w:t>
+      </w:r>
+      <w:r>
+        <w:rPr>
+          <w:i/>
+          <w:iCs/>
+        </w:rPr>
+        <w:t xml:space="preserve">7</w:t>
+      </w:r>
+      <w:r>
+        <w:t xml:space="preserve">(10), 1547–1551.</w:t>
+      </w:r>
+      <w:r>
+        <w:t xml:space="preserve"> </w:t>
+      </w:r>
+      <w:hyperlink r:id="rId90">
+        <w:r>
+          <w:rPr>
+            <w:rStyle w:val="Hyperlink"/>
+          </w:rPr>
+          <w:t xml:space="preserve">https://doi.org/10.1038/s41559-023-02161-2</w:t>
+        </w:r>
+      </w:hyperlink>
+    </w:p>
+    <w:bookmarkEnd w:id="91"/>
+    <w:bookmarkStart w:id="93" w:name="ref-johnson2024"/>
+    <w:p>
+      <w:pPr>
+        <w:pStyle w:val="Bibliography"/>
+      </w:pPr>
+      <w:r>
+        <w:t xml:space="preserve">Johnson, B., &amp; Stap, T. van der. (2024). Data mobilization through the international year of the salmon ocean observing system.</w:t>
+      </w:r>
+      <w:r>
+        <w:t xml:space="preserve"> </w:t>
+      </w:r>
+      <w:r>
+        <w:rPr>
+          <w:i/>
+          <w:iCs/>
+        </w:rPr>
+        <w:t xml:space="preserve">North Pacific Anadromous Fish Commission Bulletin</w:t>
       </w:r>
       <w:r>
         <w:t xml:space="preserve">.</w:t>
@@ -2835,33 +3265,45 @@
       <w:r>
         <w:t xml:space="preserve"> </w:t>
       </w:r>
-      <w:hyperlink r:id="rId48">
-        <w:r>
-          <w:rPr>
-            <w:rStyle w:val="Hyperlink"/>
-          </w:rPr>
-          <w:t xml:space="preserve">https://github.com/dfo-pacific-science/smn-gpt</w:t>
-        </w:r>
-      </w:hyperlink>
-    </w:p>
-    <w:bookmarkEnd w:id="74"/>
-    <w:bookmarkStart w:id="76" w:name="ref-diack2024"/>
+      <w:hyperlink r:id="rId92">
+        <w:r>
+          <w:rPr>
+            <w:rStyle w:val="Hyperlink"/>
+          </w:rPr>
+          <w:t xml:space="preserve">https://doi.org/10.23849/npafcb7/6a4ddpde4</w:t>
+        </w:r>
+      </w:hyperlink>
+    </w:p>
+    <w:bookmarkEnd w:id="93"/>
+    <w:bookmarkStart w:id="95" w:name="ref-landi_2020_a_of_fair"/>
     <w:p>
       <w:pPr>
         <w:pStyle w:val="Bibliography"/>
       </w:pPr>
       <w:r>
-        <w:t xml:space="preserve">Diack, G., Bird, T., Akenhead, S., Bayer, J., Brophy, D., Bull, C., Eyto, E. de, Johnson, B., Jones, M., Knight, A., Nevoux, M., Stap, T. van der, &amp; Walker, A. (2024). Salmon data mobilization.</w:t>
-      </w:r>
-      <w:r>
-        <w:t xml:space="preserve"> </w:t>
-      </w:r>
-      <w:r>
-        <w:rPr>
-          <w:i/>
-          <w:iCs/>
-        </w:rPr>
-        <w:t xml:space="preserve">North Pacific Anadromous Fish Commission Bulletin</w:t>
+        <w:t xml:space="preserve">Landi, A., Thompson, M., Giannuzzi, V., Bonifazi, F., Labastida, I., Silva Santos, L. O. da, Roos, M., et al. (2020). The</w:t>
+      </w:r>
+      <w:r>
+        <w:t xml:space="preserve"> </w:t>
+      </w:r>
+      <w:r>
+        <w:t xml:space="preserve">“A”</w:t>
+      </w:r>
+      <w:r>
+        <w:t xml:space="preserve"> </w:t>
+      </w:r>
+      <w:r>
+        <w:t xml:space="preserve">of FAIR – as open as possible, as closed as necessary.</w:t>
+      </w:r>
+      <w:r>
+        <w:t xml:space="preserve"> </w:t>
+      </w:r>
+      <w:r>
+        <w:rPr>
+          <w:i/>
+          <w:iCs/>
+        </w:rPr>
+        <w:t xml:space="preserve">Data Intelligence</w:t>
       </w:r>
       <w:r>
         <w:t xml:space="preserve">.</w:t>
@@ -2869,222 +3311,247 @@
       <w:r>
         <w:t xml:space="preserve"> </w:t>
       </w:r>
-      <w:hyperlink r:id="rId75">
-        <w:r>
-          <w:rPr>
-            <w:rStyle w:val="Hyperlink"/>
-          </w:rPr>
-          <w:t xml:space="preserve">https://doi.org/10.23849/npafcb7/x3rlpo23a</w:t>
-        </w:r>
-      </w:hyperlink>
-    </w:p>
-    <w:bookmarkEnd w:id="76"/>
-    <w:bookmarkStart w:id="78" w:name="ref-eartheconomics2021"/>
+      <w:hyperlink r:id="rId94">
+        <w:r>
+          <w:rPr>
+            <w:rStyle w:val="Hyperlink"/>
+          </w:rPr>
+          <w:t xml:space="preserve">https://doi.org/10.1162/dint_a_00027</w:t>
+        </w:r>
+      </w:hyperlink>
+    </w:p>
+    <w:bookmarkEnd w:id="95"/>
+    <w:bookmarkStart w:id="97" w:name="ref-lindenmayer2012"/>
     <w:p>
       <w:pPr>
         <w:pStyle w:val="Bibliography"/>
       </w:pPr>
       <w:r>
-        <w:t xml:space="preserve">Earth Economics. (2021).</w:t>
-      </w:r>
-      <w:r>
-        <w:t xml:space="preserve"> </w:t>
-      </w:r>
-      <w:r>
-        <w:rPr>
-          <w:i/>
-          <w:iCs/>
-        </w:rPr>
-        <w:t xml:space="preserve">The Sociocultural Significance of Pacific Salmon to Tribes and First Nations</w:t>
-      </w:r>
-      <w:r>
-        <w:t xml:space="preserve"> </w:t>
-      </w:r>
-      <w:r>
-        <w:t xml:space="preserve">(p. 73).</w:t>
-      </w:r>
-      <w:r>
-        <w:t xml:space="preserve"> </w:t>
-      </w:r>
-      <w:hyperlink r:id="rId77">
-        <w:r>
-          <w:rPr>
-            <w:rStyle w:val="Hyperlink"/>
-          </w:rPr>
-          <w:t xml:space="preserve">https://www.psc.org/wp-content/uploads/wpfd/preview_files/The-Sociocultural-Significance-of-Salmon-to-Tribes-and-First-Nations(5da9942da9fb4fe0d77eb32bd6165e43).pdf</w:t>
-        </w:r>
-      </w:hyperlink>
-    </w:p>
-    <w:bookmarkEnd w:id="78"/>
-    <w:bookmarkStart w:id="80" w:name="ref-noauthor_fraser_2025"/>
+        <w:t xml:space="preserve">LINDENMAYER, D. B., LIKENS, G. E., ANDERSEN, A., BOWMAN, D., BULL, C. M., BURNS, E., DICKMAN, C. R., HOFFMANN, A. A., KEITH, D. A., LIDDELL, M. J., LOWE, A. J., METCALFE, D. J., PHINN, S. R., RUSSELL-SMITH, J., THURGATE, N., &amp; WARDLE, G. M. (2012). Value of long</w:t>
+      </w:r>
+      <w:r>
+        <w:t xml:space="preserve">-</w:t>
+      </w:r>
+      <w:r>
+        <w:t xml:space="preserve">term ecological studies.</w:t>
+      </w:r>
+      <w:r>
+        <w:t xml:space="preserve"> </w:t>
+      </w:r>
+      <w:r>
+        <w:rPr>
+          <w:i/>
+          <w:iCs/>
+        </w:rPr>
+        <w:t xml:space="preserve">Austral Ecology</w:t>
+      </w:r>
+      <w:r>
+        <w:t xml:space="preserve">,</w:t>
+      </w:r>
+      <w:r>
+        <w:t xml:space="preserve"> </w:t>
+      </w:r>
+      <w:r>
+        <w:rPr>
+          <w:i/>
+          <w:iCs/>
+        </w:rPr>
+        <w:t xml:space="preserve">37</w:t>
+      </w:r>
+      <w:r>
+        <w:t xml:space="preserve">(7), 745–757.</w:t>
+      </w:r>
+      <w:r>
+        <w:t xml:space="preserve"> </w:t>
+      </w:r>
+      <w:hyperlink r:id="rId96">
+        <w:r>
+          <w:rPr>
+            <w:rStyle w:val="Hyperlink"/>
+          </w:rPr>
+          <w:t xml:space="preserve">https://doi.org/10.1111/j.1442-9993.2011.02351.x</w:t>
+        </w:r>
+      </w:hyperlink>
+    </w:p>
+    <w:bookmarkEnd w:id="97"/>
+    <w:bookmarkStart w:id="99" w:name="ref-LocalContexts2025"/>
     <w:p>
       <w:pPr>
         <w:pStyle w:val="Bibliography"/>
       </w:pPr>
       <w:r>
-        <w:rPr>
-          <w:i/>
-          <w:iCs/>
-        </w:rPr>
-        <w:t xml:space="preserve">Fraser</w:t>
-      </w:r>
-      <w:r>
-        <w:rPr>
-          <w:i/>
-          <w:iCs/>
-        </w:rPr>
-        <w:t xml:space="preserve"> </w:t>
-      </w:r>
-      <w:r>
-        <w:rPr>
-          <w:i/>
-          <w:iCs/>
-        </w:rPr>
-        <w:t xml:space="preserve">River</w:t>
-      </w:r>
-      <w:r>
-        <w:rPr>
-          <w:i/>
-          <w:iCs/>
-        </w:rPr>
-        <w:t xml:space="preserve"> </w:t>
-      </w:r>
-      <w:r>
-        <w:rPr>
-          <w:i/>
-          <w:iCs/>
-        </w:rPr>
-        <w:t xml:space="preserve">Panel</w:t>
-      </w:r>
-      <w:r>
-        <w:rPr>
-          <w:i/>
-          <w:iCs/>
-        </w:rPr>
-        <w:t xml:space="preserve"> </w:t>
-      </w:r>
-      <w:r>
-        <w:rPr>
-          <w:i/>
-          <w:iCs/>
-        </w:rPr>
-        <w:t xml:space="preserve">Data</w:t>
-      </w:r>
-      <w:r>
-        <w:rPr>
-          <w:i/>
-          <w:iCs/>
-        </w:rPr>
-        <w:t xml:space="preserve"> </w:t>
-      </w:r>
-      <w:r>
-        <w:rPr>
-          <w:i/>
-          <w:iCs/>
-        </w:rPr>
-        <w:t xml:space="preserve">Application</w:t>
-      </w:r>
-      <w:r>
-        <w:t xml:space="preserve">. (2025). Pacific Salmon Commission.</w:t>
-      </w:r>
-      <w:r>
-        <w:t xml:space="preserve"> </w:t>
-      </w:r>
-      <w:hyperlink r:id="rId79">
-        <w:r>
-          <w:rPr>
-            <w:rStyle w:val="Hyperlink"/>
-          </w:rPr>
-          <w:t xml:space="preserve">https://psc1.shinyapps.io/PSC_In_Season_Fraser/</w:t>
-        </w:r>
-      </w:hyperlink>
-    </w:p>
-    <w:bookmarkEnd w:id="80"/>
-    <w:bookmarkStart w:id="82" w:name="ref-gofair_a12_auth"/>
+        <w:t xml:space="preserve">Local Contexts. (2025).</w:t>
+      </w:r>
+      <w:r>
+        <w:t xml:space="preserve"> </w:t>
+      </w:r>
+      <w:r>
+        <w:rPr>
+          <w:i/>
+          <w:iCs/>
+        </w:rPr>
+        <w:t xml:space="preserve">Local contexts: Grounding indigenous rights in data and collections</w:t>
+      </w:r>
+      <w:r>
+        <w:t xml:space="preserve">.</w:t>
+      </w:r>
+      <w:r>
+        <w:t xml:space="preserve"> </w:t>
+      </w:r>
+      <w:r>
+        <w:t xml:space="preserve">Local Contexts</w:t>
+      </w:r>
+      <w:r>
+        <w:t xml:space="preserve">.</w:t>
+      </w:r>
+      <w:r>
+        <w:t xml:space="preserve"> </w:t>
+      </w:r>
+      <w:hyperlink r:id="rId98">
+        <w:r>
+          <w:rPr>
+            <w:rStyle w:val="Hyperlink"/>
+          </w:rPr>
+          <w:t xml:space="preserve">https://localcontexts.org/</w:t>
+        </w:r>
+      </w:hyperlink>
+    </w:p>
+    <w:bookmarkEnd w:id="99"/>
+    <w:bookmarkStart w:id="101" w:name="ref-marmorek2011"/>
     <w:p>
       <w:pPr>
         <w:pStyle w:val="Bibliography"/>
       </w:pPr>
       <w:r>
-        <w:t xml:space="preserve">GO FAIR Initiative. (n.d.).</w:t>
-      </w:r>
-      <w:r>
-        <w:t xml:space="preserve"> </w:t>
-      </w:r>
-      <w:r>
-        <w:rPr>
-          <w:i/>
-          <w:iCs/>
-        </w:rPr>
-        <w:t xml:space="preserve">A1.2: The protocol allows for an authentication and authorisation procedure, where necessary</w:t>
-      </w:r>
-      <w:r>
-        <w:t xml:space="preserve">. Web page.</w:t>
-      </w:r>
-      <w:r>
-        <w:t xml:space="preserve"> </w:t>
-      </w:r>
-      <w:hyperlink r:id="rId81">
-        <w:r>
-          <w:rPr>
-            <w:rStyle w:val="Hyperlink"/>
-          </w:rPr>
-          <w:t xml:space="preserve">https://www.go-fair.org/fair-principles/a1-2-protocol-allows-authentication-authorisation-required/</w:t>
-        </w:r>
-      </w:hyperlink>
-    </w:p>
-    <w:bookmarkEnd w:id="82"/>
-    <w:bookmarkStart w:id="84" w:name="ref-groot1991"/>
+        <w:t xml:space="preserve">Marmorek, D., Pickard, D., Hall, A., Bryan, K., Martell, L., Alexander, C., Wieckowski, K., Greig, L., &amp; Schwarz, C. (2011).</w:t>
+      </w:r>
+      <w:r>
+        <w:t xml:space="preserve"> </w:t>
+      </w:r>
+      <w:r>
+        <w:rPr>
+          <w:i/>
+          <w:iCs/>
+        </w:rPr>
+        <w:t xml:space="preserve">Cohen Commision Technical Report 6-Fraser River sockeye salmon: data synthesis and cumulative impacts</w:t>
+      </w:r>
+      <w:r>
+        <w:t xml:space="preserve"> </w:t>
+      </w:r>
+      <w:r>
+        <w:t xml:space="preserve">(p. 273).</w:t>
+      </w:r>
+      <w:r>
+        <w:t xml:space="preserve"> </w:t>
+      </w:r>
+      <w:hyperlink r:id="rId100">
+        <w:r>
+          <w:rPr>
+            <w:rStyle w:val="Hyperlink"/>
+          </w:rPr>
+          <w:t xml:space="preserve">http://www.cohencommission.ca/</w:t>
+        </w:r>
+      </w:hyperlink>
+    </w:p>
+    <w:bookmarkEnd w:id="101"/>
+    <w:bookmarkStart w:id="103" w:name="ref-montenegro2019"/>
     <w:p>
       <w:pPr>
         <w:pStyle w:val="Bibliography"/>
       </w:pPr>
       <w:r>
-        <w:t xml:space="preserve">Groot, C., &amp; Margolis, L. (1991).</w:t>
-      </w:r>
-      <w:r>
-        <w:t xml:space="preserve"> </w:t>
-      </w:r>
-      <w:r>
-        <w:rPr>
-          <w:i/>
-          <w:iCs/>
-        </w:rPr>
-        <w:t xml:space="preserve">Pacific Salmon Life Histories</w:t>
-      </w:r>
-      <w:r>
-        <w:t xml:space="preserve">. UBC Press.</w:t>
-      </w:r>
-      <w:r>
-        <w:t xml:space="preserve"> </w:t>
-      </w:r>
-      <w:hyperlink r:id="rId83">
-        <w:r>
-          <w:rPr>
-            <w:rStyle w:val="Hyperlink"/>
-          </w:rPr>
-          <w:t xml:space="preserve">https://books.google.ca/books?id=I_S0xCME0CYC</w:t>
-        </w:r>
-      </w:hyperlink>
-    </w:p>
-    <w:bookmarkEnd w:id="84"/>
-    <w:bookmarkStart w:id="86" w:name="ref-inman2021"/>
+        <w:t xml:space="preserve">Montenegro, M. (2019). Subverting the universality of metadata standards.</w:t>
+      </w:r>
+      <w:r>
+        <w:t xml:space="preserve"> </w:t>
+      </w:r>
+      <w:r>
+        <w:rPr>
+          <w:i/>
+          <w:iCs/>
+        </w:rPr>
+        <w:t xml:space="preserve">Journal of Documentation</w:t>
+      </w:r>
+      <w:r>
+        <w:t xml:space="preserve">,</w:t>
+      </w:r>
+      <w:r>
+        <w:t xml:space="preserve"> </w:t>
+      </w:r>
+      <w:r>
+        <w:rPr>
+          <w:i/>
+          <w:iCs/>
+        </w:rPr>
+        <w:t xml:space="preserve">75</w:t>
+      </w:r>
+      <w:r>
+        <w:t xml:space="preserve">(4), 731–749.</w:t>
+      </w:r>
+      <w:r>
+        <w:t xml:space="preserve"> </w:t>
+      </w:r>
+      <w:hyperlink r:id="rId102">
+        <w:r>
+          <w:rPr>
+            <w:rStyle w:val="Hyperlink"/>
+          </w:rPr>
+          <w:t xml:space="preserve">https://doi.org/10.1108/jd-08-2018-0124</w:t>
+        </w:r>
+      </w:hyperlink>
+    </w:p>
+    <w:bookmarkEnd w:id="103"/>
+    <w:bookmarkStart w:id="105" w:name="ref-environm2007"/>
     <w:p>
       <w:pPr>
         <w:pStyle w:val="Bibliography"/>
       </w:pPr>
       <w:r>
-        <w:t xml:space="preserve">Inman, S., Esquible, J., Jones, M., Bechtol, W., &amp; Connors, B. (2021). Opportunities and impediments for use of local data in the management of salmon fisheries.</w:t>
-      </w:r>
-      <w:r>
-        <w:t xml:space="preserve"> </w:t>
-      </w:r>
-      <w:r>
-        <w:rPr>
-          <w:i/>
-          <w:iCs/>
-        </w:rPr>
-        <w:t xml:space="preserve">Ecology and Society</w:t>
+        <w:t xml:space="preserve">NOAA. (2007).</w:t>
+      </w:r>
+      <w:r>
+        <w:t xml:space="preserve"> </w:t>
+      </w:r>
+      <w:r>
+        <w:rPr>
+          <w:i/>
+          <w:iCs/>
+        </w:rPr>
+        <w:t xml:space="preserve">Environmental data management at NOAA</w:t>
+      </w:r>
+      <w:r>
+        <w:t xml:space="preserve">. National Academies Press.</w:t>
+      </w:r>
+      <w:r>
+        <w:t xml:space="preserve"> </w:t>
+      </w:r>
+      <w:hyperlink r:id="rId104">
+        <w:r>
+          <w:rPr>
+            <w:rStyle w:val="Hyperlink"/>
+          </w:rPr>
+          <w:t xml:space="preserve">https://doi.org/10.17226/12017</w:t>
+        </w:r>
+      </w:hyperlink>
+    </w:p>
+    <w:bookmarkEnd w:id="105"/>
+    <w:bookmarkStart w:id="107" w:name="ref-peng2018"/>
+    <w:p>
+      <w:pPr>
+        <w:pStyle w:val="Bibliography"/>
+      </w:pPr>
+      <w:r>
+        <w:t xml:space="preserve">Peng, G., Privette, J. L., Tilmes, C., Bristol, S., Maycock, T., Bates, J. J., Hausman, S., Brown, O., &amp; Kearns, E. J. (2018). A Conceptual Enterprise Framework for Managing Scientific Data Stewardship.</w:t>
+      </w:r>
+      <w:r>
+        <w:t xml:space="preserve"> </w:t>
+      </w:r>
+      <w:r>
+        <w:rPr>
+          <w:i/>
+          <w:iCs/>
+        </w:rPr>
+        <w:t xml:space="preserve">Data Science Journal</w:t>
       </w:r>
       <w:r>
         <w:t xml:space="preserve">,</w:t>
@@ -3097,86 +3564,132 @@
           <w:i/>
           <w:iCs/>
         </w:rPr>
-        <w:t xml:space="preserve">26</w:t>
-      </w:r>
-      <w:r>
-        <w:t xml:space="preserve">(2).</w:t>
-      </w:r>
-      <w:r>
-        <w:t xml:space="preserve"> </w:t>
-      </w:r>
-      <w:hyperlink r:id="rId85">
-        <w:r>
-          <w:rPr>
-            <w:rStyle w:val="Hyperlink"/>
-          </w:rPr>
-          <w:t xml:space="preserve">https://doi.org/10.5751/ES-12117-260226</w:t>
-        </w:r>
-      </w:hyperlink>
-    </w:p>
-    <w:bookmarkEnd w:id="86"/>
-    <w:bookmarkStart w:id="88" w:name="ref-iso9241_210_2019"/>
+        <w:t xml:space="preserve">17</w:t>
+      </w:r>
+      <w:r>
+        <w:t xml:space="preserve">.</w:t>
+      </w:r>
+      <w:r>
+        <w:t xml:space="preserve"> </w:t>
+      </w:r>
+      <w:hyperlink r:id="rId106">
+        <w:r>
+          <w:rPr>
+            <w:rStyle w:val="Hyperlink"/>
+          </w:rPr>
+          <w:t xml:space="preserve">https://doi.org/10.5334/dsj-2018-015</w:t>
+        </w:r>
+      </w:hyperlink>
+    </w:p>
+    <w:bookmarkEnd w:id="107"/>
+    <w:bookmarkStart w:id="109" w:name="ref-peterman2012"/>
     <w:p>
       <w:pPr>
         <w:pStyle w:val="Bibliography"/>
       </w:pPr>
       <w:r>
-        <w:t xml:space="preserve">ISO</w:t>
-      </w:r>
-      <w:r>
-        <w:t xml:space="preserve"> </w:t>
-      </w:r>
-      <w:r>
-        <w:t xml:space="preserve">9241-210:2019 Ergonomics of Human-System Interaction – Part 210: Human-Centred Design for Interactive Systems (2019).</w:t>
-      </w:r>
-      <w:r>
-        <w:t xml:space="preserve"> </w:t>
-      </w:r>
-      <w:hyperlink r:id="rId87">
-        <w:r>
-          <w:rPr>
-            <w:rStyle w:val="Hyperlink"/>
-          </w:rPr>
-          <w:t xml:space="preserve">https://www.iso.org/standard/77520.html</w:t>
-        </w:r>
-      </w:hyperlink>
-    </w:p>
-    <w:bookmarkEnd w:id="88"/>
-    <w:bookmarkStart w:id="90" w:name="ref-jennings2023a"/>
+        <w:t xml:space="preserve">Peterman, Randall M., &amp; Dorner, B. (2012). A widespread decrease in productivity of sockeye salmon (</w:t>
+      </w:r>
+      <w:r>
+        <w:rPr>
+          <w:i/>
+          <w:iCs/>
+        </w:rPr>
+        <w:t xml:space="preserve">Oncorhynchus nerka</w:t>
+      </w:r>
+      <w:r>
+        <w:t xml:space="preserve">) populations in western North America.</w:t>
+      </w:r>
+      <w:r>
+        <w:t xml:space="preserve"> </w:t>
+      </w:r>
+      <w:r>
+        <w:rPr>
+          <w:i/>
+          <w:iCs/>
+        </w:rPr>
+        <w:t xml:space="preserve">Canadian Journal of Fisheries and Aquatic Sciences</w:t>
+      </w:r>
+      <w:r>
+        <w:t xml:space="preserve">,</w:t>
+      </w:r>
+      <w:r>
+        <w:t xml:space="preserve"> </w:t>
+      </w:r>
+      <w:r>
+        <w:rPr>
+          <w:i/>
+          <w:iCs/>
+        </w:rPr>
+        <w:t xml:space="preserve">69</w:t>
+      </w:r>
+      <w:r>
+        <w:t xml:space="preserve">(8), 1255–1260.</w:t>
+      </w:r>
+      <w:r>
+        <w:t xml:space="preserve"> </w:t>
+      </w:r>
+      <w:hyperlink r:id="rId108">
+        <w:r>
+          <w:rPr>
+            <w:rStyle w:val="Hyperlink"/>
+          </w:rPr>
+          <w:t xml:space="preserve">https://doi.org/10.1139/f2012-063</w:t>
+        </w:r>
+      </w:hyperlink>
+    </w:p>
+    <w:bookmarkEnd w:id="109"/>
+    <w:bookmarkStart w:id="111" w:name="ref-plotkin2014"/>
     <w:p>
       <w:pPr>
         <w:pStyle w:val="Bibliography"/>
       </w:pPr>
       <w:r>
-        <w:t xml:space="preserve">Jennings, L., Anderson, T., Martinez, A., Sterling, R., Chavez, D. D., Garba, I., Hudson, M., Garrison, N. A., &amp; Carroll, S. R. (2023). Applying the</w:t>
-      </w:r>
-      <w:r>
-        <w:t xml:space="preserve"> </w:t>
-      </w:r>
-      <w:r>
-        <w:t xml:space="preserve">‘</w:t>
-      </w:r>
-      <w:r>
-        <w:t xml:space="preserve">CARE Principles for Indigenous Data Governance</w:t>
-      </w:r>
-      <w:r>
-        <w:t xml:space="preserve">’</w:t>
-      </w:r>
-      <w:r>
-        <w:t xml:space="preserve"> </w:t>
-      </w:r>
-      <w:r>
-        <w:t xml:space="preserve">to ecology and biodiversity research.</w:t>
-      </w:r>
-      <w:r>
-        <w:t xml:space="preserve"> </w:t>
-      </w:r>
-      <w:r>
-        <w:rPr>
-          <w:i/>
-          <w:iCs/>
-        </w:rPr>
-        <w:t xml:space="preserve">Nature Ecology &amp; Evolution</w:t>
+        <w:t xml:space="preserve">Plotkin, D. (2014).</w:t>
+      </w:r>
+      <w:r>
+        <w:t xml:space="preserve"> </w:t>
+      </w:r>
+      <w:r>
+        <w:rPr>
+          <w:i/>
+          <w:iCs/>
+        </w:rPr>
+        <w:t xml:space="preserve">Data Stewardship</w:t>
+      </w:r>
+      <w:r>
+        <w:t xml:space="preserve">. Elsevier.</w:t>
+      </w:r>
+      <w:r>
+        <w:t xml:space="preserve"> </w:t>
+      </w:r>
+      <w:hyperlink r:id="rId110">
+        <w:r>
+          <w:rPr>
+            <w:rStyle w:val="Hyperlink"/>
+          </w:rPr>
+          <w:t xml:space="preserve">https://doi.org/10.1016/c2012-0-07057-3</w:t>
+        </w:r>
+      </w:hyperlink>
+    </w:p>
+    <w:bookmarkEnd w:id="111"/>
+    <w:bookmarkStart w:id="113" w:name="ref-price_moore_2026_policy_to_practice"/>
+    <w:p>
+      <w:pPr>
+        <w:pStyle w:val="Bibliography"/>
+      </w:pPr>
+      <w:r>
+        <w:t xml:space="preserve">Price, M. H. H., &amp; Moore, J. W. (2026). From policy to practice: Declines in monitoring and pacific salmon conservation in canada.</w:t>
+      </w:r>
+      <w:r>
+        <w:t xml:space="preserve"> </w:t>
+      </w:r>
+      <w:r>
+        <w:rPr>
+          <w:i/>
+          <w:iCs/>
+        </w:rPr>
+        <w:t xml:space="preserve">Canadian Journal of Fisheries and Aquatic Sciences</w:t>
       </w:r>
       <w:r>
         <w:t xml:space="preserve">,</w:t>
@@ -3189,41 +3702,453 @@
           <w:i/>
           <w:iCs/>
         </w:rPr>
+        <w:t xml:space="preserve">83</w:t>
+      </w:r>
+      <w:r>
+        <w:t xml:space="preserve">, 1–11.</w:t>
+      </w:r>
+      <w:r>
+        <w:t xml:space="preserve"> </w:t>
+      </w:r>
+      <w:hyperlink r:id="rId112">
+        <w:r>
+          <w:rPr>
+            <w:rStyle w:val="Hyperlink"/>
+          </w:rPr>
+          <w:t xml:space="preserve">http://www.michaelprice.org/uploads/1/0/8/9/108971119/from-policy-to-practice-declines-in-monitoring-and-pacific-salmon-conservation-in-canada__1_.pdf</w:t>
+        </w:r>
+      </w:hyperlink>
+    </w:p>
+    <w:bookmarkEnd w:id="113"/>
+    <w:bookmarkStart w:id="115" w:name="ref-roche2020"/>
+    <w:p>
+      <w:pPr>
+        <w:pStyle w:val="Bibliography"/>
+      </w:pPr>
+      <w:r>
+        <w:t xml:space="preserve">Roche, D. G., Granados, M., Austin, C. C., Wilson, S., Mitchell, G. M., Smith, P. A., Cooke, S. J., &amp; Bennett, J. R. (2020). Open government data and environmental science: a federal Canadian perspective.</w:t>
+      </w:r>
+      <w:r>
+        <w:t xml:space="preserve"> </w:t>
+      </w:r>
+      <w:r>
+        <w:rPr>
+          <w:i/>
+          <w:iCs/>
+        </w:rPr>
+        <w:t xml:space="preserve">FACETS</w:t>
+      </w:r>
+      <w:r>
+        <w:t xml:space="preserve">,</w:t>
+      </w:r>
+      <w:r>
+        <w:t xml:space="preserve"> </w:t>
+      </w:r>
+      <w:r>
+        <w:rPr>
+          <w:i/>
+          <w:iCs/>
+        </w:rPr>
+        <w:t xml:space="preserve">5</w:t>
+      </w:r>
+      <w:r>
+        <w:t xml:space="preserve">(1), 942–962.</w:t>
+      </w:r>
+      <w:r>
+        <w:t xml:space="preserve"> </w:t>
+      </w:r>
+      <w:hyperlink r:id="rId114">
+        <w:r>
+          <w:rPr>
+            <w:rStyle w:val="Hyperlink"/>
+          </w:rPr>
+          <w:t xml:space="preserve">https://doi.org/10.1139/facets-2020-0008</w:t>
+        </w:r>
+      </w:hyperlink>
+    </w:p>
+    <w:bookmarkEnd w:id="115"/>
+    <w:bookmarkStart w:id="117" w:name="ref-streamnet_des_2024_1"/>
+    <w:p>
+      <w:pPr>
+        <w:pStyle w:val="Bibliography"/>
+      </w:pPr>
+      <w:r>
+        <w:t xml:space="preserve">StreamNet. (2024).</w:t>
+      </w:r>
+      <w:r>
+        <w:t xml:space="preserve"> </w:t>
+      </w:r>
+      <w:r>
+        <w:rPr>
+          <w:i/>
+          <w:iCs/>
+        </w:rPr>
+        <w:t xml:space="preserve">StreamNet data exchange standard (DES), version 2024.1</w:t>
+      </w:r>
+      <w:r>
+        <w:t xml:space="preserve">.</w:t>
+      </w:r>
+      <w:r>
+        <w:t xml:space="preserve"> </w:t>
+      </w:r>
+      <w:hyperlink r:id="rId116">
+        <w:r>
+          <w:rPr>
+            <w:rStyle w:val="Hyperlink"/>
+          </w:rPr>
+          <w:t xml:space="preserve">https://www.streamnet.org/streamnetexchangestandard2024-1/</w:t>
+        </w:r>
+      </w:hyperlink>
+    </w:p>
+    <w:bookmarkEnd w:id="117"/>
+    <w:bookmarkStart w:id="119" w:name="ref-tattersall_2025_ids_open_data"/>
+    <w:p>
+      <w:pPr>
+        <w:pStyle w:val="Bibliography"/>
+      </w:pPr>
+      <w:r>
+        <w:t xml:space="preserve">Tattersall, E., Cardinal-McTeague, W., Myers-Smith, I., Jenkins, D. A., &amp; Burton, A. C. (2025). Affirming indigenous data sovereignty in collaborative wildlife conservation in the era of open data.</w:t>
+      </w:r>
+      <w:r>
+        <w:t xml:space="preserve"> </w:t>
+      </w:r>
+      <w:r>
+        <w:rPr>
+          <w:i/>
+          <w:iCs/>
+        </w:rPr>
+        <w:t xml:space="preserve">People and Nature</w:t>
+      </w:r>
+      <w:r>
+        <w:t xml:space="preserve">,</w:t>
+      </w:r>
+      <w:r>
+        <w:t xml:space="preserve"> </w:t>
+      </w:r>
+      <w:r>
+        <w:rPr>
+          <w:i/>
+          <w:iCs/>
+        </w:rPr>
         <w:t xml:space="preserve">7</w:t>
       </w:r>
       <w:r>
-        <w:t xml:space="preserve">(10), 1547–1551.</w:t>
-      </w:r>
-      <w:r>
-        <w:t xml:space="preserve"> </w:t>
-      </w:r>
-      <w:hyperlink r:id="rId89">
-        <w:r>
-          <w:rPr>
-            <w:rStyle w:val="Hyperlink"/>
-          </w:rPr>
-          <w:t xml:space="preserve">https://doi.org/10.1038/s41559-023-02161-2</w:t>
-        </w:r>
-      </w:hyperlink>
-    </w:p>
-    <w:bookmarkEnd w:id="90"/>
-    <w:bookmarkStart w:id="92" w:name="ref-johnson2024"/>
+        <w:t xml:space="preserve">(11), 2659–2677.</w:t>
+      </w:r>
+      <w:r>
+        <w:t xml:space="preserve"> </w:t>
+      </w:r>
+      <w:hyperlink r:id="rId118">
+        <w:r>
+          <w:rPr>
+            <w:rStyle w:val="Hyperlink"/>
+          </w:rPr>
+          <w:t xml:space="preserve">https://doi.org/10.1002/pan3.70161</w:t>
+        </w:r>
+      </w:hyperlink>
+    </w:p>
+    <w:bookmarkEnd w:id="119"/>
+    <w:bookmarkStart w:id="121" w:name="ref-volk2014"/>
     <w:p>
       <w:pPr>
         <w:pStyle w:val="Bibliography"/>
       </w:pPr>
       <w:r>
-        <w:t xml:space="preserve">Johnson, B., &amp; Stap, T. van der. (2024). Data mobilization through the international year of the salmon ocean observing system.</w:t>
-      </w:r>
-      <w:r>
-        <w:t xml:space="preserve"> </w:t>
-      </w:r>
-      <w:r>
-        <w:rPr>
-          <w:i/>
-          <w:iCs/>
-        </w:rPr>
-        <w:t xml:space="preserve">North Pacific Anadromous Fish Commission Bulletin</w:t>
+        <w:t xml:space="preserve">Volk, C. J., Lucero, Y., &amp; Barnas, K. (2014). Why is Data Sharing in Collaborative Natural Resource Efforts so Hard and What can We Do to Improve it?</w:t>
+      </w:r>
+      <w:r>
+        <w:t xml:space="preserve"> </w:t>
+      </w:r>
+      <w:r>
+        <w:rPr>
+          <w:i/>
+          <w:iCs/>
+        </w:rPr>
+        <w:t xml:space="preserve">Environmental Management</w:t>
+      </w:r>
+      <w:r>
+        <w:t xml:space="preserve">,</w:t>
+      </w:r>
+      <w:r>
+        <w:t xml:space="preserve"> </w:t>
+      </w:r>
+      <w:r>
+        <w:rPr>
+          <w:i/>
+          <w:iCs/>
+        </w:rPr>
+        <w:t xml:space="preserve">53</w:t>
+      </w:r>
+      <w:r>
+        <w:t xml:space="preserve">(5), 883–893.</w:t>
+      </w:r>
+      <w:r>
+        <w:t xml:space="preserve"> </w:t>
+      </w:r>
+      <w:hyperlink r:id="rId120">
+        <w:r>
+          <w:rPr>
+            <w:rStyle w:val="Hyperlink"/>
+          </w:rPr>
+          <w:t xml:space="preserve">https://doi.org/10.1007/s00267-014-0258-2</w:t>
+        </w:r>
+      </w:hyperlink>
+    </w:p>
+    <w:bookmarkEnd w:id="121"/>
+    <w:bookmarkStart w:id="123" w:name="ref-w3c_prov_dm_2013"/>
+    <w:p>
+      <w:pPr>
+        <w:pStyle w:val="Bibliography"/>
+      </w:pPr>
+      <w:r>
+        <w:t xml:space="preserve">W3C. (2013).</w:t>
+      </w:r>
+      <w:r>
+        <w:t xml:space="preserve"> </w:t>
+      </w:r>
+      <w:r>
+        <w:rPr>
+          <w:i/>
+          <w:iCs/>
+        </w:rPr>
+        <w:t xml:space="preserve">PROV-DM</w:t>
+      </w:r>
+      <w:r>
+        <w:rPr>
+          <w:i/>
+          <w:iCs/>
+        </w:rPr>
+        <w:t xml:space="preserve">: The</w:t>
+      </w:r>
+      <w:r>
+        <w:rPr>
+          <w:i/>
+          <w:iCs/>
+        </w:rPr>
+        <w:t xml:space="preserve"> </w:t>
+      </w:r>
+      <w:r>
+        <w:rPr>
+          <w:i/>
+          <w:iCs/>
+        </w:rPr>
+        <w:t xml:space="preserve">PROV</w:t>
+      </w:r>
+      <w:r>
+        <w:rPr>
+          <w:i/>
+          <w:iCs/>
+        </w:rPr>
+        <w:t xml:space="preserve"> </w:t>
+      </w:r>
+      <w:r>
+        <w:rPr>
+          <w:i/>
+          <w:iCs/>
+        </w:rPr>
+        <w:t xml:space="preserve">data model</w:t>
+      </w:r>
+      <w:r>
+        <w:t xml:space="preserve">. W3C Recommendation.</w:t>
+      </w:r>
+      <w:r>
+        <w:t xml:space="preserve"> </w:t>
+      </w:r>
+      <w:hyperlink r:id="rId122">
+        <w:r>
+          <w:rPr>
+            <w:rStyle w:val="Hyperlink"/>
+          </w:rPr>
+          <w:t xml:space="preserve">https://www.w3.org/TR/prov-dm/</w:t>
+        </w:r>
+      </w:hyperlink>
+    </w:p>
+    <w:bookmarkEnd w:id="123"/>
+    <w:bookmarkStart w:id="125" w:name="ref-ward_surveyjoin_2025"/>
+    <w:p>
+      <w:pPr>
+        <w:pStyle w:val="Bibliography"/>
+      </w:pPr>
+      <w:r>
+        <w:t xml:space="preserve">Ward, E. J., English, P. A., Rooper, C. N., Ferriss, B. E., Whitmire, C. E., Wetzel, C. R., Barnett, L. A., Anderson, S. C., Thorson, J. T., Johnson, K. F., Indivero, J., &amp; Markowitz, E. H. (2025).</w:t>
+      </w:r>
+      <w:r>
+        <w:t xml:space="preserve"> </w:t>
+      </w:r>
+      <w:r>
+        <w:rPr>
+          <w:i/>
+          <w:iCs/>
+        </w:rPr>
+        <w:t xml:space="preserve">‘Surveyjoin‘:</w:t>
+      </w:r>
+      <w:r>
+        <w:rPr>
+          <w:i/>
+          <w:iCs/>
+        </w:rPr>
+        <w:t xml:space="preserve"> </w:t>
+      </w:r>
+      <w:r>
+        <w:rPr>
+          <w:i/>
+          <w:iCs/>
+        </w:rPr>
+        <w:t xml:space="preserve">A</w:t>
+      </w:r>
+      <w:r>
+        <w:rPr>
+          <w:i/>
+          <w:iCs/>
+        </w:rPr>
+        <w:t xml:space="preserve"> </w:t>
+      </w:r>
+      <w:r>
+        <w:rPr>
+          <w:i/>
+          <w:iCs/>
+        </w:rPr>
+        <w:t xml:space="preserve">Standardized</w:t>
+      </w:r>
+      <w:r>
+        <w:rPr>
+          <w:i/>
+          <w:iCs/>
+        </w:rPr>
+        <w:t xml:space="preserve"> </w:t>
+      </w:r>
+      <w:r>
+        <w:rPr>
+          <w:i/>
+          <w:iCs/>
+        </w:rPr>
+        <w:t xml:space="preserve">Database</w:t>
+      </w:r>
+      <w:r>
+        <w:rPr>
+          <w:i/>
+          <w:iCs/>
+        </w:rPr>
+        <w:t xml:space="preserve"> </w:t>
+      </w:r>
+      <w:r>
+        <w:rPr>
+          <w:i/>
+          <w:iCs/>
+        </w:rPr>
+        <w:t xml:space="preserve">of</w:t>
+      </w:r>
+      <w:r>
+        <w:rPr>
+          <w:i/>
+          <w:iCs/>
+        </w:rPr>
+        <w:t xml:space="preserve"> </w:t>
+      </w:r>
+      <w:r>
+        <w:rPr>
+          <w:i/>
+          <w:iCs/>
+        </w:rPr>
+        <w:t xml:space="preserve">Fisheries</w:t>
+      </w:r>
+      <w:r>
+        <w:rPr>
+          <w:i/>
+          <w:iCs/>
+        </w:rPr>
+        <w:t xml:space="preserve"> </w:t>
+      </w:r>
+      <w:r>
+        <w:rPr>
+          <w:i/>
+          <w:iCs/>
+        </w:rPr>
+        <w:t xml:space="preserve">Bottom</w:t>
+      </w:r>
+      <w:r>
+        <w:rPr>
+          <w:i/>
+          <w:iCs/>
+        </w:rPr>
+        <w:t xml:space="preserve"> </w:t>
+      </w:r>
+      <w:r>
+        <w:rPr>
+          <w:i/>
+          <w:iCs/>
+        </w:rPr>
+        <w:t xml:space="preserve">Trawl</w:t>
+      </w:r>
+      <w:r>
+        <w:rPr>
+          <w:i/>
+          <w:iCs/>
+        </w:rPr>
+        <w:t xml:space="preserve"> </w:t>
+      </w:r>
+      <w:r>
+        <w:rPr>
+          <w:i/>
+          <w:iCs/>
+        </w:rPr>
+        <w:t xml:space="preserve">Surveys</w:t>
+      </w:r>
+      <w:r>
+        <w:rPr>
+          <w:i/>
+          <w:iCs/>
+        </w:rPr>
+        <w:t xml:space="preserve"> </w:t>
+      </w:r>
+      <w:r>
+        <w:rPr>
+          <w:i/>
+          <w:iCs/>
+        </w:rPr>
+        <w:t xml:space="preserve">in the</w:t>
+      </w:r>
+      <w:r>
+        <w:rPr>
+          <w:i/>
+          <w:iCs/>
+        </w:rPr>
+        <w:t xml:space="preserve"> </w:t>
+      </w:r>
+      <w:r>
+        <w:rPr>
+          <w:i/>
+          <w:iCs/>
+        </w:rPr>
+        <w:t xml:space="preserve">Northeast</w:t>
+      </w:r>
+      <w:r>
+        <w:rPr>
+          <w:i/>
+          <w:iCs/>
+        </w:rPr>
+        <w:t xml:space="preserve"> </w:t>
+      </w:r>
+      <w:r>
+        <w:rPr>
+          <w:i/>
+          <w:iCs/>
+        </w:rPr>
+        <w:t xml:space="preserve">Pacific</w:t>
+      </w:r>
+      <w:r>
+        <w:rPr>
+          <w:i/>
+          <w:iCs/>
+        </w:rPr>
+        <w:t xml:space="preserve"> </w:t>
+      </w:r>
+      <w:r>
+        <w:rPr>
+          <w:i/>
+          <w:iCs/>
+        </w:rPr>
+        <w:t xml:space="preserve">Ocean</w:t>
       </w:r>
       <w:r>
         <w:t xml:space="preserve">.</w:t>
@@ -3231,85 +4156,80 @@
       <w:r>
         <w:t xml:space="preserve"> </w:t>
       </w:r>
-      <w:hyperlink r:id="rId91">
-        <w:r>
-          <w:rPr>
-            <w:rStyle w:val="Hyperlink"/>
-          </w:rPr>
-          <w:t xml:space="preserve">https://doi.org/10.23849/npafcb7/6a4ddpde4</w:t>
-        </w:r>
-      </w:hyperlink>
-    </w:p>
-    <w:bookmarkEnd w:id="92"/>
-    <w:bookmarkStart w:id="94" w:name="ref-landi_2020_a_of_fair"/>
+      <w:hyperlink r:id="rId124">
+        <w:r>
+          <w:rPr>
+            <w:rStyle w:val="Hyperlink"/>
+          </w:rPr>
+          <w:t xml:space="preserve">https://doi.org/10.1101/2025.03.14.643022</w:t>
+        </w:r>
+      </w:hyperlink>
+    </w:p>
+    <w:bookmarkEnd w:id="125"/>
+    <w:bookmarkStart w:id="127" w:name="ref-ween2013"/>
     <w:p>
       <w:pPr>
         <w:pStyle w:val="Bibliography"/>
       </w:pPr>
       <w:r>
-        <w:t xml:space="preserve">Landi, A., Thompson, M., Giannuzzi, V., Bonifazi, F., Labastida, I., Silva Santos, L. O. da, Roos, M., et al. (2020). The</w:t>
-      </w:r>
-      <w:r>
-        <w:t xml:space="preserve"> </w:t>
-      </w:r>
-      <w:r>
-        <w:t xml:space="preserve">“A”</w:t>
-      </w:r>
-      <w:r>
-        <w:t xml:space="preserve"> </w:t>
-      </w:r>
-      <w:r>
-        <w:t xml:space="preserve">of FAIR – as open as possible, as closed as necessary.</w:t>
-      </w:r>
-      <w:r>
-        <w:t xml:space="preserve"> </w:t>
-      </w:r>
-      <w:r>
-        <w:rPr>
-          <w:i/>
-          <w:iCs/>
-        </w:rPr>
-        <w:t xml:space="preserve">Data Intelligence</w:t>
-      </w:r>
-      <w:r>
-        <w:t xml:space="preserve">.</w:t>
-      </w:r>
-      <w:r>
-        <w:t xml:space="preserve"> </w:t>
-      </w:r>
-      <w:hyperlink r:id="rId93">
-        <w:r>
-          <w:rPr>
-            <w:rStyle w:val="Hyperlink"/>
-          </w:rPr>
-          <w:t xml:space="preserve">https://doi.org/10.1162/dint_a_00027</w:t>
-        </w:r>
-      </w:hyperlink>
-    </w:p>
-    <w:bookmarkEnd w:id="94"/>
-    <w:bookmarkStart w:id="96" w:name="ref-lindenmayer2012"/>
+        <w:t xml:space="preserve">Ween, G., &amp; Colombi, B. (2013). Two Rivers: The Politics of Wild Salmon, Indigenous Rights and Natural Resource Management.</w:t>
+      </w:r>
+      <w:r>
+        <w:t xml:space="preserve"> </w:t>
+      </w:r>
+      <w:r>
+        <w:rPr>
+          <w:i/>
+          <w:iCs/>
+        </w:rPr>
+        <w:t xml:space="preserve">Sustainability</w:t>
+      </w:r>
+      <w:r>
+        <w:t xml:space="preserve">,</w:t>
+      </w:r>
+      <w:r>
+        <w:t xml:space="preserve"> </w:t>
+      </w:r>
+      <w:r>
+        <w:rPr>
+          <w:i/>
+          <w:iCs/>
+        </w:rPr>
+        <w:t xml:space="preserve">5</w:t>
+      </w:r>
+      <w:r>
+        <w:t xml:space="preserve">(2), 478–495.</w:t>
+      </w:r>
+      <w:r>
+        <w:t xml:space="preserve"> </w:t>
+      </w:r>
+      <w:hyperlink r:id="rId126">
+        <w:r>
+          <w:rPr>
+            <w:rStyle w:val="Hyperlink"/>
+          </w:rPr>
+          <w:t xml:space="preserve">https://doi.org/10.3390/su5020478</w:t>
+        </w:r>
+      </w:hyperlink>
+    </w:p>
+    <w:bookmarkEnd w:id="127"/>
+    <w:bookmarkStart w:id="129" w:name="ref-wilkinson2016"/>
     <w:p>
       <w:pPr>
         <w:pStyle w:val="Bibliography"/>
       </w:pPr>
       <w:r>
-        <w:t xml:space="preserve">LINDENMAYER, D. B., LIKENS, G. E., ANDERSEN, A., BOWMAN, D., BULL, C. M., BURNS, E., DICKMAN, C. R., HOFFMANN, A. A., KEITH, D. A., LIDDELL, M. J., LOWE, A. J., METCALFE, D. J., PHINN, S. R., RUSSELL-SMITH, J., THURGATE, N., &amp; WARDLE, G. M. (2012). Value of long</w:t>
-      </w:r>
-      <w:r>
-        <w:t xml:space="preserve">-</w:t>
-      </w:r>
-      <w:r>
-        <w:t xml:space="preserve">term ecological studies.</w:t>
-      </w:r>
-      <w:r>
-        <w:t xml:space="preserve"> </w:t>
-      </w:r>
-      <w:r>
-        <w:rPr>
-          <w:i/>
-          <w:iCs/>
-        </w:rPr>
-        <w:t xml:space="preserve">Austral Ecology</w:t>
+        <w:t xml:space="preserve">Wilkinson, M. D., Dumontier, M., Aalbersberg, Ij. J., Appleton, G., Axton, M., Baak, A., Blomberg, N., Boiten, J.-W., Silva Santos, L. B. da, Bourne, P. E., Bouwman, J., Brookes, A. J., Clark, T., Crosas, M., Dillo, I., Dumon, O., Edmunds, S., Evelo, C. T., Finkers, R., … Mons, B. (2016). The FAIR Guiding Principles for scientific data management and stewardship.</w:t>
+      </w:r>
+      <w:r>
+        <w:t xml:space="preserve"> </w:t>
+      </w:r>
+      <w:r>
+        <w:rPr>
+          <w:i/>
+          <w:iCs/>
+        </w:rPr>
+        <w:t xml:space="preserve">Scientific Data</w:t>
       </w:r>
       <w:r>
         <w:t xml:space="preserve">,</w:t>
@@ -3322,892 +4242,6 @@
           <w:i/>
           <w:iCs/>
         </w:rPr>
-        <w:t xml:space="preserve">37</w:t>
-      </w:r>
-      <w:r>
-        <w:t xml:space="preserve">(7), 745–757.</w:t>
-      </w:r>
-      <w:r>
-        <w:t xml:space="preserve"> </w:t>
-      </w:r>
-      <w:hyperlink r:id="rId95">
-        <w:r>
-          <w:rPr>
-            <w:rStyle w:val="Hyperlink"/>
-          </w:rPr>
-          <w:t xml:space="preserve">https://doi.org/10.1111/j.1442-9993.2011.02351.x</w:t>
-        </w:r>
-      </w:hyperlink>
-    </w:p>
-    <w:bookmarkEnd w:id="96"/>
-    <w:bookmarkStart w:id="98" w:name="ref-LocalContexts2025"/>
-    <w:p>
-      <w:pPr>
-        <w:pStyle w:val="Bibliography"/>
-      </w:pPr>
-      <w:r>
-        <w:t xml:space="preserve">Local Contexts. (2025).</w:t>
-      </w:r>
-      <w:r>
-        <w:t xml:space="preserve"> </w:t>
-      </w:r>
-      <w:r>
-        <w:rPr>
-          <w:i/>
-          <w:iCs/>
-        </w:rPr>
-        <w:t xml:space="preserve">Local contexts: Grounding indigenous rights in data and collections</w:t>
-      </w:r>
-      <w:r>
-        <w:t xml:space="preserve">.</w:t>
-      </w:r>
-      <w:r>
-        <w:t xml:space="preserve"> </w:t>
-      </w:r>
-      <w:r>
-        <w:t xml:space="preserve">Local Contexts</w:t>
-      </w:r>
-      <w:r>
-        <w:t xml:space="preserve">.</w:t>
-      </w:r>
-      <w:r>
-        <w:t xml:space="preserve"> </w:t>
-      </w:r>
-      <w:hyperlink r:id="rId97">
-        <w:r>
-          <w:rPr>
-            <w:rStyle w:val="Hyperlink"/>
-          </w:rPr>
-          <w:t xml:space="preserve">https://localcontexts.org/</w:t>
-        </w:r>
-      </w:hyperlink>
-    </w:p>
-    <w:bookmarkEnd w:id="98"/>
-    <w:bookmarkStart w:id="100" w:name="ref-marmorek2011"/>
-    <w:p>
-      <w:pPr>
-        <w:pStyle w:val="Bibliography"/>
-      </w:pPr>
-      <w:r>
-        <w:t xml:space="preserve">Marmorek, D., Pickard, D., Hall, A., Bryan, K., Martell, L., Alexander, C., Wieckowski, K., Greig, L., &amp; Schwarz, C. (2011).</w:t>
-      </w:r>
-      <w:r>
-        <w:t xml:space="preserve"> </w:t>
-      </w:r>
-      <w:r>
-        <w:rPr>
-          <w:i/>
-          <w:iCs/>
-        </w:rPr>
-        <w:t xml:space="preserve">Cohen Commision Technical Report 6-Fraser River sockeye salmon: data synthesis and cumulative impacts</w:t>
-      </w:r>
-      <w:r>
-        <w:t xml:space="preserve"> </w:t>
-      </w:r>
-      <w:r>
-        <w:t xml:space="preserve">(p. 273).</w:t>
-      </w:r>
-      <w:r>
-        <w:t xml:space="preserve"> </w:t>
-      </w:r>
-      <w:hyperlink r:id="rId99">
-        <w:r>
-          <w:rPr>
-            <w:rStyle w:val="Hyperlink"/>
-          </w:rPr>
-          <w:t xml:space="preserve">http://www.cohencommission.ca/</w:t>
-        </w:r>
-      </w:hyperlink>
-    </w:p>
-    <w:bookmarkEnd w:id="100"/>
-    <w:bookmarkStart w:id="102" w:name="ref-montenegro2019"/>
-    <w:p>
-      <w:pPr>
-        <w:pStyle w:val="Bibliography"/>
-      </w:pPr>
-      <w:r>
-        <w:t xml:space="preserve">Montenegro, M. (2019). Subverting the universality of metadata standards.</w:t>
-      </w:r>
-      <w:r>
-        <w:t xml:space="preserve"> </w:t>
-      </w:r>
-      <w:r>
-        <w:rPr>
-          <w:i/>
-          <w:iCs/>
-        </w:rPr>
-        <w:t xml:space="preserve">Journal of Documentation</w:t>
-      </w:r>
-      <w:r>
-        <w:t xml:space="preserve">,</w:t>
-      </w:r>
-      <w:r>
-        <w:t xml:space="preserve"> </w:t>
-      </w:r>
-      <w:r>
-        <w:rPr>
-          <w:i/>
-          <w:iCs/>
-        </w:rPr>
-        <w:t xml:space="preserve">75</w:t>
-      </w:r>
-      <w:r>
-        <w:t xml:space="preserve">(4), 731–749.</w:t>
-      </w:r>
-      <w:r>
-        <w:t xml:space="preserve"> </w:t>
-      </w:r>
-      <w:hyperlink r:id="rId101">
-        <w:r>
-          <w:rPr>
-            <w:rStyle w:val="Hyperlink"/>
-          </w:rPr>
-          <w:t xml:space="preserve">https://doi.org/10.1108/jd-08-2018-0124</w:t>
-        </w:r>
-      </w:hyperlink>
-    </w:p>
-    <w:bookmarkEnd w:id="102"/>
-    <w:bookmarkStart w:id="104" w:name="ref-environm2007"/>
-    <w:p>
-      <w:pPr>
-        <w:pStyle w:val="Bibliography"/>
-      </w:pPr>
-      <w:r>
-        <w:t xml:space="preserve">NOAA. (2007).</w:t>
-      </w:r>
-      <w:r>
-        <w:t xml:space="preserve"> </w:t>
-      </w:r>
-      <w:r>
-        <w:rPr>
-          <w:i/>
-          <w:iCs/>
-        </w:rPr>
-        <w:t xml:space="preserve">Environmental data management at NOAA</w:t>
-      </w:r>
-      <w:r>
-        <w:t xml:space="preserve">. National Academies Press.</w:t>
-      </w:r>
-      <w:r>
-        <w:t xml:space="preserve"> </w:t>
-      </w:r>
-      <w:hyperlink r:id="rId103">
-        <w:r>
-          <w:rPr>
-            <w:rStyle w:val="Hyperlink"/>
-          </w:rPr>
-          <w:t xml:space="preserve">https://doi.org/10.17226/12017</w:t>
-        </w:r>
-      </w:hyperlink>
-    </w:p>
-    <w:bookmarkEnd w:id="104"/>
-    <w:bookmarkStart w:id="106" w:name="ref-peng2018"/>
-    <w:p>
-      <w:pPr>
-        <w:pStyle w:val="Bibliography"/>
-      </w:pPr>
-      <w:r>
-        <w:t xml:space="preserve">Peng, G., Privette, J. L., Tilmes, C., Bristol, S., Maycock, T., Bates, J. J., Hausman, S., Brown, O., &amp; Kearns, E. J. (2018). A Conceptual Enterprise Framework for Managing Scientific Data Stewardship.</w:t>
-      </w:r>
-      <w:r>
-        <w:t xml:space="preserve"> </w:t>
-      </w:r>
-      <w:r>
-        <w:rPr>
-          <w:i/>
-          <w:iCs/>
-        </w:rPr>
-        <w:t xml:space="preserve">Data Science Journal</w:t>
-      </w:r>
-      <w:r>
-        <w:t xml:space="preserve">,</w:t>
-      </w:r>
-      <w:r>
-        <w:t xml:space="preserve"> </w:t>
-      </w:r>
-      <w:r>
-        <w:rPr>
-          <w:i/>
-          <w:iCs/>
-        </w:rPr>
-        <w:t xml:space="preserve">17</w:t>
-      </w:r>
-      <w:r>
-        <w:t xml:space="preserve">.</w:t>
-      </w:r>
-      <w:r>
-        <w:t xml:space="preserve"> </w:t>
-      </w:r>
-      <w:hyperlink r:id="rId105">
-        <w:r>
-          <w:rPr>
-            <w:rStyle w:val="Hyperlink"/>
-          </w:rPr>
-          <w:t xml:space="preserve">https://doi.org/10.5334/dsj-2018-015</w:t>
-        </w:r>
-      </w:hyperlink>
-    </w:p>
-    <w:bookmarkEnd w:id="106"/>
-    <w:bookmarkStart w:id="108" w:name="ref-peterman2012"/>
-    <w:p>
-      <w:pPr>
-        <w:pStyle w:val="Bibliography"/>
-      </w:pPr>
-      <w:r>
-        <w:t xml:space="preserve">Peterman, Randall M., &amp; Dorner, B. (2012). A widespread decrease in productivity of sockeye salmon (</w:t>
-      </w:r>
-      <w:r>
-        <w:rPr>
-          <w:i/>
-          <w:iCs/>
-        </w:rPr>
-        <w:t xml:space="preserve">Oncorhynchus nerka</w:t>
-      </w:r>
-      <w:r>
-        <w:t xml:space="preserve">) populations in western North America.</w:t>
-      </w:r>
-      <w:r>
-        <w:t xml:space="preserve"> </w:t>
-      </w:r>
-      <w:r>
-        <w:rPr>
-          <w:i/>
-          <w:iCs/>
-        </w:rPr>
-        <w:t xml:space="preserve">Canadian Journal of Fisheries and Aquatic Sciences</w:t>
-      </w:r>
-      <w:r>
-        <w:t xml:space="preserve">,</w:t>
-      </w:r>
-      <w:r>
-        <w:t xml:space="preserve"> </w:t>
-      </w:r>
-      <w:r>
-        <w:rPr>
-          <w:i/>
-          <w:iCs/>
-        </w:rPr>
-        <w:t xml:space="preserve">69</w:t>
-      </w:r>
-      <w:r>
-        <w:t xml:space="preserve">(8), 1255–1260.</w:t>
-      </w:r>
-      <w:r>
-        <w:t xml:space="preserve"> </w:t>
-      </w:r>
-      <w:hyperlink r:id="rId107">
-        <w:r>
-          <w:rPr>
-            <w:rStyle w:val="Hyperlink"/>
-          </w:rPr>
-          <w:t xml:space="preserve">https://doi.org/10.1139/f2012-063</w:t>
-        </w:r>
-      </w:hyperlink>
-    </w:p>
-    <w:bookmarkEnd w:id="108"/>
-    <w:bookmarkStart w:id="110" w:name="ref-plotkin2014"/>
-    <w:p>
-      <w:pPr>
-        <w:pStyle w:val="Bibliography"/>
-      </w:pPr>
-      <w:r>
-        <w:t xml:space="preserve">Plotkin, D. (2014).</w:t>
-      </w:r>
-      <w:r>
-        <w:t xml:space="preserve"> </w:t>
-      </w:r>
-      <w:r>
-        <w:rPr>
-          <w:i/>
-          <w:iCs/>
-        </w:rPr>
-        <w:t xml:space="preserve">Data Stewardship</w:t>
-      </w:r>
-      <w:r>
-        <w:t xml:space="preserve">. Elsevier.</w:t>
-      </w:r>
-      <w:r>
-        <w:t xml:space="preserve"> </w:t>
-      </w:r>
-      <w:hyperlink r:id="rId109">
-        <w:r>
-          <w:rPr>
-            <w:rStyle w:val="Hyperlink"/>
-          </w:rPr>
-          <w:t xml:space="preserve">https://doi.org/10.1016/c2012-0-07057-3</w:t>
-        </w:r>
-      </w:hyperlink>
-    </w:p>
-    <w:bookmarkEnd w:id="110"/>
-    <w:bookmarkStart w:id="112" w:name="ref-price_moore_2026_policy_to_practice"/>
-    <w:p>
-      <w:pPr>
-        <w:pStyle w:val="Bibliography"/>
-      </w:pPr>
-      <w:r>
-        <w:t xml:space="preserve">Price, M. H. H., &amp; Moore, J. W. (2026). From policy to practice: Declines in monitoring and pacific salmon conservation in canada.</w:t>
-      </w:r>
-      <w:r>
-        <w:t xml:space="preserve"> </w:t>
-      </w:r>
-      <w:r>
-        <w:rPr>
-          <w:i/>
-          <w:iCs/>
-        </w:rPr>
-        <w:t xml:space="preserve">Canadian Journal of Fisheries and Aquatic Sciences</w:t>
-      </w:r>
-      <w:r>
-        <w:t xml:space="preserve">,</w:t>
-      </w:r>
-      <w:r>
-        <w:t xml:space="preserve"> </w:t>
-      </w:r>
-      <w:r>
-        <w:rPr>
-          <w:i/>
-          <w:iCs/>
-        </w:rPr>
-        <w:t xml:space="preserve">83</w:t>
-      </w:r>
-      <w:r>
-        <w:t xml:space="preserve">, 1–11.</w:t>
-      </w:r>
-      <w:r>
-        <w:t xml:space="preserve"> </w:t>
-      </w:r>
-      <w:hyperlink r:id="rId111">
-        <w:r>
-          <w:rPr>
-            <w:rStyle w:val="Hyperlink"/>
-          </w:rPr>
-          <w:t xml:space="preserve">http://www.michaelprice.org/uploads/1/0/8/9/108971119/from-policy-to-practice-declines-in-monitoring-and-pacific-salmon-conservation-in-canada__1_.pdf</w:t>
-        </w:r>
-      </w:hyperlink>
-    </w:p>
-    <w:bookmarkEnd w:id="112"/>
-    <w:bookmarkStart w:id="114" w:name="ref-roche2020"/>
-    <w:p>
-      <w:pPr>
-        <w:pStyle w:val="Bibliography"/>
-      </w:pPr>
-      <w:r>
-        <w:t xml:space="preserve">Roche, D. G., Granados, M., Austin, C. C., Wilson, S., Mitchell, G. M., Smith, P. A., Cooke, S. J., &amp; Bennett, J. R. (2020). Open government data and environmental science: a federal Canadian perspective.</w:t>
-      </w:r>
-      <w:r>
-        <w:t xml:space="preserve"> </w:t>
-      </w:r>
-      <w:r>
-        <w:rPr>
-          <w:i/>
-          <w:iCs/>
-        </w:rPr>
-        <w:t xml:space="preserve">FACETS</w:t>
-      </w:r>
-      <w:r>
-        <w:t xml:space="preserve">,</w:t>
-      </w:r>
-      <w:r>
-        <w:t xml:space="preserve"> </w:t>
-      </w:r>
-      <w:r>
-        <w:rPr>
-          <w:i/>
-          <w:iCs/>
-        </w:rPr>
-        <w:t xml:space="preserve">5</w:t>
-      </w:r>
-      <w:r>
-        <w:t xml:space="preserve">(1), 942–962.</w:t>
-      </w:r>
-      <w:r>
-        <w:t xml:space="preserve"> </w:t>
-      </w:r>
-      <w:hyperlink r:id="rId113">
-        <w:r>
-          <w:rPr>
-            <w:rStyle w:val="Hyperlink"/>
-          </w:rPr>
-          <w:t xml:space="preserve">https://doi.org/10.1139/facets-2020-0008</w:t>
-        </w:r>
-      </w:hyperlink>
-    </w:p>
-    <w:bookmarkEnd w:id="114"/>
-    <w:bookmarkStart w:id="116" w:name="ref-streamnet_des_2024_1"/>
-    <w:p>
-      <w:pPr>
-        <w:pStyle w:val="Bibliography"/>
-      </w:pPr>
-      <w:r>
-        <w:t xml:space="preserve">StreamNet. (2024).</w:t>
-      </w:r>
-      <w:r>
-        <w:t xml:space="preserve"> </w:t>
-      </w:r>
-      <w:r>
-        <w:rPr>
-          <w:i/>
-          <w:iCs/>
-        </w:rPr>
-        <w:t xml:space="preserve">StreamNet data exchange standard (DES), version 2024.1</w:t>
-      </w:r>
-      <w:r>
-        <w:t xml:space="preserve">.</w:t>
-      </w:r>
-      <w:r>
-        <w:t xml:space="preserve"> </w:t>
-      </w:r>
-      <w:hyperlink r:id="rId115">
-        <w:r>
-          <w:rPr>
-            <w:rStyle w:val="Hyperlink"/>
-          </w:rPr>
-          <w:t xml:space="preserve">https://www.streamnet.org/streamnetexchangestandard2024-1/</w:t>
-        </w:r>
-      </w:hyperlink>
-    </w:p>
-    <w:bookmarkEnd w:id="116"/>
-    <w:bookmarkStart w:id="118" w:name="ref-tattersall_2025_ids_open_data"/>
-    <w:p>
-      <w:pPr>
-        <w:pStyle w:val="Bibliography"/>
-      </w:pPr>
-      <w:r>
-        <w:t xml:space="preserve">Tattersall, E., Cardinal-McTeague, W., Myers-Smith, I., Jenkins, D. A., &amp; Burton, A. C. (2025). Affirming indigenous data sovereignty in collaborative wildlife conservation in the era of open data.</w:t>
-      </w:r>
-      <w:r>
-        <w:t xml:space="preserve"> </w:t>
-      </w:r>
-      <w:r>
-        <w:rPr>
-          <w:i/>
-          <w:iCs/>
-        </w:rPr>
-        <w:t xml:space="preserve">People and Nature</w:t>
-      </w:r>
-      <w:r>
-        <w:t xml:space="preserve">,</w:t>
-      </w:r>
-      <w:r>
-        <w:t xml:space="preserve"> </w:t>
-      </w:r>
-      <w:r>
-        <w:rPr>
-          <w:i/>
-          <w:iCs/>
-        </w:rPr>
-        <w:t xml:space="preserve">7</w:t>
-      </w:r>
-      <w:r>
-        <w:t xml:space="preserve">(11), 2659–2677.</w:t>
-      </w:r>
-      <w:r>
-        <w:t xml:space="preserve"> </w:t>
-      </w:r>
-      <w:hyperlink r:id="rId117">
-        <w:r>
-          <w:rPr>
-            <w:rStyle w:val="Hyperlink"/>
-          </w:rPr>
-          <w:t xml:space="preserve">https://doi.org/10.1002/pan3.70161</w:t>
-        </w:r>
-      </w:hyperlink>
-    </w:p>
-    <w:bookmarkEnd w:id="118"/>
-    <w:bookmarkStart w:id="120" w:name="ref-volk2014"/>
-    <w:p>
-      <w:pPr>
-        <w:pStyle w:val="Bibliography"/>
-      </w:pPr>
-      <w:r>
-        <w:t xml:space="preserve">Volk, C. J., Lucero, Y., &amp; Barnas, K. (2014). Why is Data Sharing in Collaborative Natural Resource Efforts so Hard and What can We Do to Improve it?</w:t>
-      </w:r>
-      <w:r>
-        <w:t xml:space="preserve"> </w:t>
-      </w:r>
-      <w:r>
-        <w:rPr>
-          <w:i/>
-          <w:iCs/>
-        </w:rPr>
-        <w:t xml:space="preserve">Environmental Management</w:t>
-      </w:r>
-      <w:r>
-        <w:t xml:space="preserve">,</w:t>
-      </w:r>
-      <w:r>
-        <w:t xml:space="preserve"> </w:t>
-      </w:r>
-      <w:r>
-        <w:rPr>
-          <w:i/>
-          <w:iCs/>
-        </w:rPr>
-        <w:t xml:space="preserve">53</w:t>
-      </w:r>
-      <w:r>
-        <w:t xml:space="preserve">(5), 883–893.</w:t>
-      </w:r>
-      <w:r>
-        <w:t xml:space="preserve"> </w:t>
-      </w:r>
-      <w:hyperlink r:id="rId119">
-        <w:r>
-          <w:rPr>
-            <w:rStyle w:val="Hyperlink"/>
-          </w:rPr>
-          <w:t xml:space="preserve">https://doi.org/10.1007/s00267-014-0258-2</w:t>
-        </w:r>
-      </w:hyperlink>
-    </w:p>
-    <w:bookmarkEnd w:id="120"/>
-    <w:bookmarkStart w:id="122" w:name="ref-w3c_prov_dm_2013"/>
-    <w:p>
-      <w:pPr>
-        <w:pStyle w:val="Bibliography"/>
-      </w:pPr>
-      <w:r>
-        <w:t xml:space="preserve">W3C. (2013).</w:t>
-      </w:r>
-      <w:r>
-        <w:t xml:space="preserve"> </w:t>
-      </w:r>
-      <w:r>
-        <w:rPr>
-          <w:i/>
-          <w:iCs/>
-        </w:rPr>
-        <w:t xml:space="preserve">PROV-DM</w:t>
-      </w:r>
-      <w:r>
-        <w:rPr>
-          <w:i/>
-          <w:iCs/>
-        </w:rPr>
-        <w:t xml:space="preserve">: The</w:t>
-      </w:r>
-      <w:r>
-        <w:rPr>
-          <w:i/>
-          <w:iCs/>
-        </w:rPr>
-        <w:t xml:space="preserve"> </w:t>
-      </w:r>
-      <w:r>
-        <w:rPr>
-          <w:i/>
-          <w:iCs/>
-        </w:rPr>
-        <w:t xml:space="preserve">PROV</w:t>
-      </w:r>
-      <w:r>
-        <w:rPr>
-          <w:i/>
-          <w:iCs/>
-        </w:rPr>
-        <w:t xml:space="preserve"> </w:t>
-      </w:r>
-      <w:r>
-        <w:rPr>
-          <w:i/>
-          <w:iCs/>
-        </w:rPr>
-        <w:t xml:space="preserve">data model</w:t>
-      </w:r>
-      <w:r>
-        <w:t xml:space="preserve">. W3C Recommendation.</w:t>
-      </w:r>
-      <w:r>
-        <w:t xml:space="preserve"> </w:t>
-      </w:r>
-      <w:hyperlink r:id="rId121">
-        <w:r>
-          <w:rPr>
-            <w:rStyle w:val="Hyperlink"/>
-          </w:rPr>
-          <w:t xml:space="preserve">https://www.w3.org/TR/prov-dm/</w:t>
-        </w:r>
-      </w:hyperlink>
-    </w:p>
-    <w:bookmarkEnd w:id="122"/>
-    <w:bookmarkStart w:id="124" w:name="ref-ward_surveyjoin_2025"/>
-    <w:p>
-      <w:pPr>
-        <w:pStyle w:val="Bibliography"/>
-      </w:pPr>
-      <w:r>
-        <w:t xml:space="preserve">Ward, E. J., English, P. A., Rooper, C. N., Ferriss, B. E., Whitmire, C. E., Wetzel, C. R., Barnett, L. A., Anderson, S. C., Thorson, J. T., Johnson, K. F., Indivero, J., &amp; Markowitz, E. H. (2025).</w:t>
-      </w:r>
-      <w:r>
-        <w:t xml:space="preserve"> </w:t>
-      </w:r>
-      <w:r>
-        <w:rPr>
-          <w:i/>
-          <w:iCs/>
-        </w:rPr>
-        <w:t xml:space="preserve">‘Surveyjoin‘:</w:t>
-      </w:r>
-      <w:r>
-        <w:rPr>
-          <w:i/>
-          <w:iCs/>
-        </w:rPr>
-        <w:t xml:space="preserve"> </w:t>
-      </w:r>
-      <w:r>
-        <w:rPr>
-          <w:i/>
-          <w:iCs/>
-        </w:rPr>
-        <w:t xml:space="preserve">A</w:t>
-      </w:r>
-      <w:r>
-        <w:rPr>
-          <w:i/>
-          <w:iCs/>
-        </w:rPr>
-        <w:t xml:space="preserve"> </w:t>
-      </w:r>
-      <w:r>
-        <w:rPr>
-          <w:i/>
-          <w:iCs/>
-        </w:rPr>
-        <w:t xml:space="preserve">Standardized</w:t>
-      </w:r>
-      <w:r>
-        <w:rPr>
-          <w:i/>
-          <w:iCs/>
-        </w:rPr>
-        <w:t xml:space="preserve"> </w:t>
-      </w:r>
-      <w:r>
-        <w:rPr>
-          <w:i/>
-          <w:iCs/>
-        </w:rPr>
-        <w:t xml:space="preserve">Database</w:t>
-      </w:r>
-      <w:r>
-        <w:rPr>
-          <w:i/>
-          <w:iCs/>
-        </w:rPr>
-        <w:t xml:space="preserve"> </w:t>
-      </w:r>
-      <w:r>
-        <w:rPr>
-          <w:i/>
-          <w:iCs/>
-        </w:rPr>
-        <w:t xml:space="preserve">of</w:t>
-      </w:r>
-      <w:r>
-        <w:rPr>
-          <w:i/>
-          <w:iCs/>
-        </w:rPr>
-        <w:t xml:space="preserve"> </w:t>
-      </w:r>
-      <w:r>
-        <w:rPr>
-          <w:i/>
-          <w:iCs/>
-        </w:rPr>
-        <w:t xml:space="preserve">Fisheries</w:t>
-      </w:r>
-      <w:r>
-        <w:rPr>
-          <w:i/>
-          <w:iCs/>
-        </w:rPr>
-        <w:t xml:space="preserve"> </w:t>
-      </w:r>
-      <w:r>
-        <w:rPr>
-          <w:i/>
-          <w:iCs/>
-        </w:rPr>
-        <w:t xml:space="preserve">Bottom</w:t>
-      </w:r>
-      <w:r>
-        <w:rPr>
-          <w:i/>
-          <w:iCs/>
-        </w:rPr>
-        <w:t xml:space="preserve"> </w:t>
-      </w:r>
-      <w:r>
-        <w:rPr>
-          <w:i/>
-          <w:iCs/>
-        </w:rPr>
-        <w:t xml:space="preserve">Trawl</w:t>
-      </w:r>
-      <w:r>
-        <w:rPr>
-          <w:i/>
-          <w:iCs/>
-        </w:rPr>
-        <w:t xml:space="preserve"> </w:t>
-      </w:r>
-      <w:r>
-        <w:rPr>
-          <w:i/>
-          <w:iCs/>
-        </w:rPr>
-        <w:t xml:space="preserve">Surveys</w:t>
-      </w:r>
-      <w:r>
-        <w:rPr>
-          <w:i/>
-          <w:iCs/>
-        </w:rPr>
-        <w:t xml:space="preserve"> </w:t>
-      </w:r>
-      <w:r>
-        <w:rPr>
-          <w:i/>
-          <w:iCs/>
-        </w:rPr>
-        <w:t xml:space="preserve">in the</w:t>
-      </w:r>
-      <w:r>
-        <w:rPr>
-          <w:i/>
-          <w:iCs/>
-        </w:rPr>
-        <w:t xml:space="preserve"> </w:t>
-      </w:r>
-      <w:r>
-        <w:rPr>
-          <w:i/>
-          <w:iCs/>
-        </w:rPr>
-        <w:t xml:space="preserve">Northeast</w:t>
-      </w:r>
-      <w:r>
-        <w:rPr>
-          <w:i/>
-          <w:iCs/>
-        </w:rPr>
-        <w:t xml:space="preserve"> </w:t>
-      </w:r>
-      <w:r>
-        <w:rPr>
-          <w:i/>
-          <w:iCs/>
-        </w:rPr>
-        <w:t xml:space="preserve">Pacific</w:t>
-      </w:r>
-      <w:r>
-        <w:rPr>
-          <w:i/>
-          <w:iCs/>
-        </w:rPr>
-        <w:t xml:space="preserve"> </w:t>
-      </w:r>
-      <w:r>
-        <w:rPr>
-          <w:i/>
-          <w:iCs/>
-        </w:rPr>
-        <w:t xml:space="preserve">Ocean</w:t>
-      </w:r>
-      <w:r>
-        <w:t xml:space="preserve">.</w:t>
-      </w:r>
-      <w:r>
-        <w:t xml:space="preserve"> </w:t>
-      </w:r>
-      <w:hyperlink r:id="rId123">
-        <w:r>
-          <w:rPr>
-            <w:rStyle w:val="Hyperlink"/>
-          </w:rPr>
-          <w:t xml:space="preserve">https://doi.org/10.1101/2025.03.14.643022</w:t>
-        </w:r>
-      </w:hyperlink>
-    </w:p>
-    <w:bookmarkEnd w:id="124"/>
-    <w:bookmarkStart w:id="126" w:name="ref-ween2013"/>
-    <w:p>
-      <w:pPr>
-        <w:pStyle w:val="Bibliography"/>
-      </w:pPr>
-      <w:r>
-        <w:t xml:space="preserve">Ween, G., &amp; Colombi, B. (2013). Two Rivers: The Politics of Wild Salmon, Indigenous Rights and Natural Resource Management.</w:t>
-      </w:r>
-      <w:r>
-        <w:t xml:space="preserve"> </w:t>
-      </w:r>
-      <w:r>
-        <w:rPr>
-          <w:i/>
-          <w:iCs/>
-        </w:rPr>
-        <w:t xml:space="preserve">Sustainability</w:t>
-      </w:r>
-      <w:r>
-        <w:t xml:space="preserve">,</w:t>
-      </w:r>
-      <w:r>
-        <w:t xml:space="preserve"> </w:t>
-      </w:r>
-      <w:r>
-        <w:rPr>
-          <w:i/>
-          <w:iCs/>
-        </w:rPr>
-        <w:t xml:space="preserve">5</w:t>
-      </w:r>
-      <w:r>
-        <w:t xml:space="preserve">(2), 478–495.</w:t>
-      </w:r>
-      <w:r>
-        <w:t xml:space="preserve"> </w:t>
-      </w:r>
-      <w:hyperlink r:id="rId125">
-        <w:r>
-          <w:rPr>
-            <w:rStyle w:val="Hyperlink"/>
-          </w:rPr>
-          <w:t xml:space="preserve">https://doi.org/10.3390/su5020478</w:t>
-        </w:r>
-      </w:hyperlink>
-    </w:p>
-    <w:bookmarkEnd w:id="126"/>
-    <w:bookmarkStart w:id="128" w:name="ref-wilkinson2016"/>
-    <w:p>
-      <w:pPr>
-        <w:pStyle w:val="Bibliography"/>
-      </w:pPr>
-      <w:r>
-        <w:t xml:space="preserve">Wilkinson, M. D., Dumontier, M., Aalbersberg, Ij. J., Appleton, G., Axton, M., Baak, A., Blomberg, N., Boiten, J.-W., Silva Santos, L. B. da, Bourne, P. E., Bouwman, J., Brookes, A. J., Clark, T., Crosas, M., Dillo, I., Dumon, O., Edmunds, S., Evelo, C. T., Finkers, R., … Mons, B. (2016). The FAIR Guiding Principles for scientific data management and stewardship.</w:t>
-      </w:r>
-      <w:r>
-        <w:t xml:space="preserve"> </w:t>
-      </w:r>
-      <w:r>
-        <w:rPr>
-          <w:i/>
-          <w:iCs/>
-        </w:rPr>
-        <w:t xml:space="preserve">Scientific Data</w:t>
-      </w:r>
-      <w:r>
-        <w:t xml:space="preserve">,</w:t>
-      </w:r>
-      <w:r>
-        <w:t xml:space="preserve"> </w:t>
-      </w:r>
-      <w:r>
-        <w:rPr>
-          <w:i/>
-          <w:iCs/>
-        </w:rPr>
         <w:t xml:space="preserve">3</w:t>
       </w:r>
       <w:r>
@@ -4216,7 +4250,7 @@
       <w:r>
         <w:t xml:space="preserve"> </w:t>
       </w:r>
-      <w:hyperlink r:id="rId127">
+      <w:hyperlink r:id="rId128">
         <w:r>
           <w:rPr>
             <w:rStyle w:val="Hyperlink"/>
@@ -4225,11 +4259,11 @@
         </w:r>
       </w:hyperlink>
     </w:p>
-    <w:bookmarkEnd w:id="128"/>
     <w:bookmarkEnd w:id="129"/>
     <w:bookmarkEnd w:id="130"/>
     <w:bookmarkEnd w:id="131"/>
-    <w:bookmarkStart w:id="228" w:name="appendices"/>
+    <w:bookmarkEnd w:id="132"/>
+    <w:bookmarkStart w:id="229" w:name="appendices"/>
     <w:p>
       <w:pPr>
         <w:pStyle w:val="Heading1"/>
@@ -4238,7 +4272,7 @@
         <w:t xml:space="preserve">Appendices</w:t>
       </w:r>
     </w:p>
-    <w:bookmarkStart w:id="181" w:name="X0eec7e8f025fee3ab106441c96e63641f0533a1"/>
+    <w:bookmarkStart w:id="182" w:name="X0eec7e8f025fee3ab106441c96e63641f0533a1"/>
     <w:p>
       <w:pPr>
         <w:pStyle w:val="Heading2"/>
@@ -4255,7 +4289,7 @@
         <w:t xml:space="preserve">Here we provide detailed descriptions of the seven best practices for salmon data stewardship, along with practical applications and real-world examples. This is not an exhaustive list, but rather a starting point for salmon biologists and data stewards to implement effective data stewardship practices in their work based on examples from the salmon research and management community.</w:t>
       </w:r>
     </w:p>
-    <w:bookmarkStart w:id="138" w:name="Xb12edd0657e7269c47a25b09d9d78e24cee1937"/>
+    <w:bookmarkStart w:id="139" w:name="Xb12edd0657e7269c47a25b09d9d78e24cee1937"/>
     <w:p>
       <w:pPr>
         <w:pStyle w:val="Heading4"/>
@@ -4284,7 +4318,7 @@
         <w:t xml:space="preserve">In collaborative international or multi-organizational settings, establishing governance at the outset of a project is crucial for aligning diverse groups, including biologists, data managers, Indigenous communities, policymakers, and other participants. Early governance planning should establish clear, collaborative frameworks that respect each group’s expertise and needs from the beginning. </w:t>
       </w:r>
     </w:p>
-    <w:bookmarkStart w:id="137" w:name="practical-applications"/>
+    <w:bookmarkStart w:id="138" w:name="practical-applications"/>
     <w:p>
       <w:pPr>
         <w:pStyle w:val="Heading5"/>
@@ -4308,7 +4342,7 @@
           <w:numId w:val="1007"/>
         </w:numPr>
       </w:pPr>
-      <w:hyperlink r:id="rId132">
+      <w:hyperlink r:id="rId133">
         <w:r>
           <w:rPr>
             <w:rStyle w:val="Hyperlink"/>
@@ -4330,7 +4364,7 @@
       <w:r>
         <w:t xml:space="preserve"> </w:t>
       </w:r>
-      <w:hyperlink r:id="rId133">
+      <w:hyperlink r:id="rId134">
         <w:r>
           <w:rPr>
             <w:rStyle w:val="Hyperlink"/>
@@ -4344,7 +4378,7 @@
       <w:r>
         <w:t xml:space="preserve"> </w:t>
       </w:r>
-      <w:hyperlink r:id="rId134">
+      <w:hyperlink r:id="rId135">
         <w:r>
           <w:rPr>
             <w:rStyle w:val="Hyperlink"/>
@@ -4375,7 +4409,7 @@
       <w:r>
         <w:t xml:space="preserve"> </w:t>
       </w:r>
-      <w:hyperlink r:id="rId135">
+      <w:hyperlink r:id="rId136">
         <w:r>
           <w:rPr>
             <w:rStyle w:val="Hyperlink"/>
@@ -4406,7 +4440,7 @@
       <w:r>
         <w:t xml:space="preserve"> </w:t>
       </w:r>
-      <w:hyperlink r:id="rId136">
+      <w:hyperlink r:id="rId137">
         <w:r>
           <w:rPr>
             <w:rStyle w:val="Hyperlink"/>
@@ -4415,9 +4449,9 @@
         </w:r>
       </w:hyperlink>
     </w:p>
-    <w:bookmarkEnd w:id="137"/>
     <w:bookmarkEnd w:id="138"/>
-    <w:bookmarkStart w:id="143" w:name="Xe4940526a4497d243234a137f59d11fc75e1dec"/>
+    <w:bookmarkEnd w:id="139"/>
+    <w:bookmarkStart w:id="144" w:name="Xe4940526a4497d243234a137f59d11fc75e1dec"/>
     <w:p>
       <w:pPr>
         <w:pStyle w:val="Heading4"/>
@@ -4438,7 +4472,7 @@
         <w:t xml:space="preserve">Building custom solutions should be avoided where possible. Maximizing existing platforms and technologies reduces costs, accelerates implementation, and increases data interoperability. Building modular, interoperable systems grounded in proven technologies ensures sustainable long-term stewardship.</w:t>
       </w:r>
     </w:p>
-    <w:bookmarkStart w:id="142" w:name="practical-applications-1"/>
+    <w:bookmarkStart w:id="143" w:name="practical-applications-1"/>
     <w:p>
       <w:pPr>
         <w:pStyle w:val="Heading5"/>
@@ -4457,7 +4491,7 @@
       <w:r>
         <w:t xml:space="preserve"> </w:t>
       </w:r>
-      <w:hyperlink r:id="rId139">
+      <w:hyperlink r:id="rId140">
         <w:r>
           <w:rPr>
             <w:rStyle w:val="Hyperlink"/>
@@ -4488,7 +4522,7 @@
       <w:r>
         <w:t xml:space="preserve"> </w:t>
       </w:r>
-      <w:hyperlink r:id="rId140">
+      <w:hyperlink r:id="rId141">
         <w:r>
           <w:rPr>
             <w:rStyle w:val="Hyperlink"/>
@@ -4505,7 +4539,7 @@
       <w:r>
         <w:t xml:space="preserve"> </w:t>
       </w:r>
-      <w:hyperlink r:id="rId141">
+      <w:hyperlink r:id="rId142">
         <w:r>
           <w:rPr>
             <w:rStyle w:val="Hyperlink"/>
@@ -4520,9 +4554,9 @@
         <w:t xml:space="preserve">(Pacific Salmon Foundation 2025) did over several years, illustrating that leveraging established public data infrastructures, rather than developing institution-specific ones, can substantially increase discoverability.</w:t>
       </w:r>
     </w:p>
-    <w:bookmarkEnd w:id="142"/>
     <w:bookmarkEnd w:id="143"/>
-    <w:bookmarkStart w:id="149" w:name="X2e704b3fbdac499c8de63b2db85bac328669287"/>
+    <w:bookmarkEnd w:id="144"/>
+    <w:bookmarkStart w:id="150" w:name="X2e704b3fbdac499c8de63b2db85bac328669287"/>
     <w:p>
       <w:pPr>
         <w:pStyle w:val="Heading4"/>
@@ -4543,7 +4577,7 @@
         <w:t xml:space="preserve">Persistent identifiers (PIDs), including Digital Object Identifiers (DOI) are essential for tracking the provenance and reuse of data, and linking data, protocols, organizations and people. They allow for consistent referencing, integration across systems, and automated credit via data citation.</w:t>
       </w:r>
     </w:p>
-    <w:bookmarkStart w:id="148" w:name="practical-applications-2"/>
+    <w:bookmarkStart w:id="149" w:name="practical-applications-2"/>
     <w:p>
       <w:pPr>
         <w:pStyle w:val="Heading5"/>
@@ -4562,7 +4596,7 @@
       <w:r>
         <w:t xml:space="preserve"> </w:t>
       </w:r>
-      <w:hyperlink r:id="rId144">
+      <w:hyperlink r:id="rId145">
         <w:r>
           <w:rPr>
             <w:rStyle w:val="Hyperlink"/>
@@ -4599,7 +4633,7 @@
       <w:r>
         <w:t xml:space="preserve"> </w:t>
       </w:r>
-      <w:hyperlink r:id="rId145">
+      <w:hyperlink r:id="rId146">
         <w:r>
           <w:rPr>
             <w:rStyle w:val="Hyperlink"/>
@@ -4613,7 +4647,7 @@
       <w:r>
         <w:t xml:space="preserve"> </w:t>
       </w:r>
-      <w:hyperlink r:id="rId146">
+      <w:hyperlink r:id="rId147">
         <w:r>
           <w:rPr>
             <w:rStyle w:val="Hyperlink"/>
@@ -4644,7 +4678,7 @@
       <w:r>
         <w:t xml:space="preserve"> </w:t>
       </w:r>
-      <w:hyperlink r:id="rId147">
+      <w:hyperlink r:id="rId148">
         <w:r>
           <w:rPr>
             <w:rStyle w:val="Hyperlink"/>
@@ -4676,9 +4710,9 @@
         <w:t xml:space="preserve">3.4 Embed DOIs in dashboards, figures, and metadata so they persist in derivative products.</w:t>
       </w:r>
     </w:p>
-    <w:bookmarkEnd w:id="148"/>
     <w:bookmarkEnd w:id="149"/>
-    <w:bookmarkStart w:id="157" w:name="Xae20514442a38834165b7fc789fed8fea292c0a"/>
+    <w:bookmarkEnd w:id="150"/>
+    <w:bookmarkStart w:id="158" w:name="Xae20514442a38834165b7fc789fed8fea292c0a"/>
     <w:p>
       <w:pPr>
         <w:pStyle w:val="Heading4"/>
@@ -4699,7 +4733,7 @@
         <w:t xml:space="preserve">Standardizing metadata and terminology ensures data can be interpreted correctly and integrated across systems. Controlled vocabularies, community ontologies, and structured metadata schemas allow data to retain its full semantic meaning.</w:t>
       </w:r>
     </w:p>
-    <w:bookmarkStart w:id="156" w:name="practical-applications-3"/>
+    <w:bookmarkStart w:id="157" w:name="practical-applications-3"/>
     <w:p>
       <w:pPr>
         <w:pStyle w:val="Heading5"/>
@@ -4730,7 +4764,7 @@
       <w:r>
         <w:t xml:space="preserve"> </w:t>
       </w:r>
-      <w:hyperlink r:id="rId150">
+      <w:hyperlink r:id="rId151">
         <w:r>
           <w:rPr>
             <w:rStyle w:val="Hyperlink"/>
@@ -4765,7 +4799,7 @@
       <w:r>
         <w:t xml:space="preserve"> </w:t>
       </w:r>
-      <w:hyperlink r:id="rId151">
+      <w:hyperlink r:id="rId152">
         <w:r>
           <w:rPr>
             <w:rStyle w:val="Hyperlink"/>
@@ -4787,7 +4821,7 @@
       <w:r>
         <w:t xml:space="preserve"> </w:t>
       </w:r>
-      <w:hyperlink r:id="rId152">
+      <w:hyperlink r:id="rId153">
         <w:r>
           <w:rPr>
             <w:rStyle w:val="Hyperlink"/>
@@ -4821,7 +4855,7 @@
       <w:r>
         <w:t xml:space="preserve"> </w:t>
       </w:r>
-      <w:hyperlink r:id="rId153">
+      <w:hyperlink r:id="rId154">
         <w:r>
           <w:rPr>
             <w:rStyle w:val="Hyperlink"/>
@@ -4866,7 +4900,24 @@
         </w:numPr>
       </w:pPr>
       <w:r>
-        <w:t xml:space="preserve">Treat the Salmon Domain Ontology as the canonical interoperability layer for shared salmon concepts across organizations.</w:t>
+        <w:t xml:space="preserve">Treat the</w:t>
+      </w:r>
+      <w:r>
+        <w:t xml:space="preserve"> </w:t>
+      </w:r>
+      <w:hyperlink r:id="rId42">
+        <w:r>
+          <w:rPr>
+            <w:rStyle w:val="Hyperlink"/>
+          </w:rPr>
+          <w:t xml:space="preserve">Salmon Domain Ontology</w:t>
+        </w:r>
+      </w:hyperlink>
+      <w:r>
+        <w:t xml:space="preserve"> </w:t>
+      </w:r>
+      <w:r>
+        <w:t xml:space="preserve">as the canonical interoperability layer for shared salmon concepts across organizations.</w:t>
       </w:r>
     </w:p>
     <w:p>
@@ -4882,7 +4933,7 @@
       <w:r>
         <w:t xml:space="preserve"> </w:t>
       </w:r>
-      <w:hyperlink r:id="rId47">
+      <w:hyperlink r:id="rId48">
         <w:r>
           <w:rPr>
             <w:rStyle w:val="Hyperlink"/>
@@ -4904,7 +4955,7 @@
       <w:r>
         <w:t xml:space="preserve"> </w:t>
       </w:r>
-      <w:hyperlink r:id="rId154">
+      <w:hyperlink r:id="rId155">
         <w:r>
           <w:rPr>
             <w:rStyle w:val="Hyperlink"/>
@@ -4926,7 +4977,7 @@
       <w:r>
         <w:t xml:space="preserve"> </w:t>
       </w:r>
-      <w:hyperlink r:id="rId155">
+      <w:hyperlink r:id="rId156">
         <w:r>
           <w:rPr>
             <w:rStyle w:val="Hyperlink"/>
@@ -4935,9 +4986,9 @@
         </w:r>
       </w:hyperlink>
     </w:p>
-    <w:bookmarkEnd w:id="156"/>
     <w:bookmarkEnd w:id="157"/>
-    <w:bookmarkStart w:id="168" w:name="Xb70ccb81e1d20e6b09946f09c4288cc7dc4c259"/>
+    <w:bookmarkEnd w:id="158"/>
+    <w:bookmarkStart w:id="169" w:name="Xb70ccb81e1d20e6b09946f09c4288cc7dc4c259"/>
     <w:p>
       <w:pPr>
         <w:pStyle w:val="Heading4"/>
@@ -4967,7 +5018,7 @@
         <w:t xml:space="preserve">. Data should be structured and well-documented, stored in repositories that support long-term preservation, and—where it materially improves reuse—made available via programmatic access such as APIs.</w:t>
       </w:r>
     </w:p>
-    <w:bookmarkStart w:id="167" w:name="practical-applications-4"/>
+    <w:bookmarkStart w:id="168" w:name="practical-applications-4"/>
     <w:p>
       <w:pPr>
         <w:pStyle w:val="Heading5"/>
@@ -4998,7 +5049,7 @@
       <w:r>
         <w:t xml:space="preserve"> </w:t>
       </w:r>
-      <w:hyperlink r:id="rId158">
+      <w:hyperlink r:id="rId159">
         <w:r>
           <w:rPr>
             <w:rStyle w:val="Hyperlink"/>
@@ -5015,7 +5066,7 @@
       <w:r>
         <w:t xml:space="preserve"> </w:t>
       </w:r>
-      <w:hyperlink r:id="rId159">
+      <w:hyperlink r:id="rId160">
         <w:r>
           <w:rPr>
             <w:rStyle w:val="Hyperlink"/>
@@ -5041,7 +5092,7 @@
       <w:r>
         <w:t xml:space="preserve"> </w:t>
       </w:r>
-      <w:hyperlink r:id="rId160">
+      <w:hyperlink r:id="rId161">
         <w:r>
           <w:rPr>
             <w:rStyle w:val="Hyperlink"/>
@@ -5075,7 +5126,7 @@
       <w:r>
         <w:t xml:space="preserve"> </w:t>
       </w:r>
-      <w:hyperlink r:id="rId161">
+      <w:hyperlink r:id="rId162">
         <w:r>
           <w:rPr>
             <w:rStyle w:val="Hyperlink"/>
@@ -5089,7 +5140,7 @@
       <w:r>
         <w:t xml:space="preserve"> </w:t>
       </w:r>
-      <w:hyperlink r:id="rId162">
+      <w:hyperlink r:id="rId163">
         <w:r>
           <w:rPr>
             <w:rStyle w:val="Hyperlink"/>
@@ -5115,7 +5166,7 @@
       <w:r>
         <w:t xml:space="preserve"> </w:t>
       </w:r>
-      <w:hyperlink r:id="rId152">
+      <w:hyperlink r:id="rId153">
         <w:r>
           <w:rPr>
             <w:rStyle w:val="Hyperlink"/>
@@ -5141,7 +5192,7 @@
       <w:r>
         <w:t xml:space="preserve"> </w:t>
       </w:r>
-      <w:hyperlink r:id="rId163">
+      <w:hyperlink r:id="rId164">
         <w:r>
           <w:rPr>
             <w:rStyle w:val="Hyperlink"/>
@@ -5167,7 +5218,7 @@
       <w:r>
         <w:t xml:space="preserve"> </w:t>
       </w:r>
-      <w:hyperlink r:id="rId164">
+      <w:hyperlink r:id="rId165">
         <w:r>
           <w:rPr>
             <w:rStyle w:val="Hyperlink"/>
@@ -5201,7 +5252,7 @@
       <w:r>
         <w:t xml:space="preserve"> </w:t>
       </w:r>
-      <w:hyperlink r:id="rId165">
+      <w:hyperlink r:id="rId166">
         <w:r>
           <w:rPr>
             <w:rStyle w:val="Hyperlink"/>
@@ -5215,7 +5266,7 @@
       <w:r>
         <w:t xml:space="preserve"> </w:t>
       </w:r>
-      <w:hyperlink r:id="rId140">
+      <w:hyperlink r:id="rId141">
         <w:r>
           <w:rPr>
             <w:rStyle w:val="Hyperlink"/>
@@ -5229,7 +5280,7 @@
       <w:r>
         <w:t xml:space="preserve"> </w:t>
       </w:r>
-      <w:hyperlink r:id="rId166">
+      <w:hyperlink r:id="rId167">
         <w:r>
           <w:rPr>
             <w:rStyle w:val="Hyperlink"/>
@@ -5244,9 +5295,9 @@
         <w:t xml:space="preserve">linked on both platforms. The code and dataset are updated in parallel with NuSEDS, and each dataset version is assigned a DOI to ensure proper citation and traceability.</w:t>
       </w:r>
     </w:p>
-    <w:bookmarkEnd w:id="167"/>
     <w:bookmarkEnd w:id="168"/>
-    <w:bookmarkStart w:id="175" w:name="X6ecba5178706d3de6618a6e7ac4228d51e04728"/>
+    <w:bookmarkEnd w:id="169"/>
+    <w:bookmarkStart w:id="176" w:name="X6ecba5178706d3de6618a6e7ac4228d51e04728"/>
     <w:p>
       <w:pPr>
         <w:pStyle w:val="Heading4"/>
@@ -5267,7 +5318,7 @@
         <w:t xml:space="preserve">The currency of research lies in recognition—credit, citations, and opportunities for collaboration or co-authorship. Promoting data sharing requires both cultural and technical infrastructure. The cultural infrastructure requires a shift towards viewing data publication as equal in importance to article publication. The infrastructure put in place needs to support the process of generating citation records that give credit to all First Nations, Tribes, agencies, and organizations. By recognizing contributions, tracking reuse, and supporting citation, data stewards can create a system where sharing is rewarded.</w:t>
       </w:r>
     </w:p>
-    <w:bookmarkStart w:id="174" w:name="practical-applications-5"/>
+    <w:bookmarkStart w:id="175" w:name="practical-applications-5"/>
     <w:p>
       <w:pPr>
         <w:pStyle w:val="Heading5"/>
@@ -5298,7 +5349,7 @@
       <w:r>
         <w:t xml:space="preserve"> </w:t>
       </w:r>
-      <w:hyperlink r:id="rId147">
+      <w:hyperlink r:id="rId148">
         <w:r>
           <w:rPr>
             <w:rStyle w:val="Hyperlink"/>
@@ -5315,7 +5366,7 @@
       <w:r>
         <w:t xml:space="preserve"> </w:t>
       </w:r>
-      <w:hyperlink r:id="rId169">
+      <w:hyperlink r:id="rId170">
         <w:r>
           <w:rPr>
             <w:rStyle w:val="Hyperlink"/>
@@ -5346,7 +5397,7 @@
       <w:r>
         <w:t xml:space="preserve"> </w:t>
       </w:r>
-      <w:hyperlink r:id="rId161">
+      <w:hyperlink r:id="rId162">
         <w:r>
           <w:rPr>
             <w:rStyle w:val="Hyperlink"/>
@@ -5372,7 +5423,7 @@
       <w:r>
         <w:t xml:space="preserve"> </w:t>
       </w:r>
-      <w:hyperlink r:id="rId170">
+      <w:hyperlink r:id="rId171">
         <w:r>
           <w:rPr>
             <w:rStyle w:val="Hyperlink"/>
@@ -5394,7 +5445,7 @@
       <w:r>
         <w:t xml:space="preserve"> </w:t>
       </w:r>
-      <w:hyperlink r:id="rId171">
+      <w:hyperlink r:id="rId172">
         <w:r>
           <w:rPr>
             <w:rStyle w:val="Hyperlink"/>
@@ -5423,7 +5474,7 @@
       <w:r>
         <w:t xml:space="preserve"> </w:t>
       </w:r>
-      <w:hyperlink r:id="rId172">
+      <w:hyperlink r:id="rId173">
         <w:r>
           <w:rPr>
             <w:rStyle w:val="Hyperlink"/>
@@ -5494,7 +5545,7 @@
       <w:r>
         <w:t xml:space="preserve">The cleaned NuSEDS dataset (see Section 5.3) was used in an analysis and cited in the associated publication (</w:t>
       </w:r>
-      <w:hyperlink r:id="rId57">
+      <w:hyperlink r:id="rId58">
         <w:r>
           <w:rPr>
             <w:rStyle w:val="Hyperlink"/>
@@ -5508,7 +5559,7 @@
       <w:r>
         <w:t xml:space="preserve"> </w:t>
       </w:r>
-      <w:hyperlink r:id="rId173">
+      <w:hyperlink r:id="rId174">
         <w:r>
           <w:rPr>
             <w:rStyle w:val="Hyperlink"/>
@@ -5552,9 +5603,9 @@
         <w:t xml:space="preserve">Encourage teams to include dataset DOIs in CVs, annual reports, and program dashboards alongside article outputs.</w:t>
       </w:r>
     </w:p>
-    <w:bookmarkEnd w:id="174"/>
     <w:bookmarkEnd w:id="175"/>
-    <w:bookmarkStart w:id="180" w:name="Xede4e5f3133f4905776a2981e7117d5b19a5441"/>
+    <w:bookmarkEnd w:id="176"/>
+    <w:bookmarkStart w:id="181" w:name="Xede4e5f3133f4905776a2981e7117d5b19a5441"/>
     <w:p>
       <w:pPr>
         <w:pStyle w:val="Heading4"/>
@@ -5596,7 +5647,7 @@
         <w:t xml:space="preserve">to be effective. Engaging biologists, Indigenous stewards, and data managers ensures relevance, usability, and long-term participation.</w:t>
       </w:r>
     </w:p>
-    <w:bookmarkStart w:id="179" w:name="practical-applications-6"/>
+    <w:bookmarkStart w:id="180" w:name="practical-applications-6"/>
     <w:p>
       <w:pPr>
         <w:pStyle w:val="Heading5"/>
@@ -5615,7 +5666,7 @@
       <w:r>
         <w:t xml:space="preserve"> </w:t>
       </w:r>
-      <w:hyperlink r:id="rId176">
+      <w:hyperlink r:id="rId177">
         <w:r>
           <w:rPr>
             <w:rStyle w:val="Hyperlink"/>
@@ -5649,7 +5700,7 @@
       <w:r>
         <w:t xml:space="preserve"> </w:t>
       </w:r>
-      <w:hyperlink r:id="rId177">
+      <w:hyperlink r:id="rId178">
         <w:r>
           <w:rPr>
             <w:rStyle w:val="Hyperlink"/>
@@ -5665,7 +5716,7 @@
       <w:r>
         <w:t xml:space="preserve">7.3 Support and follow through on Community Engaged Research (e.g. </w:t>
       </w:r>
-      <w:hyperlink r:id="rId178">
+      <w:hyperlink r:id="rId179">
         <w:r>
           <w:rPr>
             <w:rStyle w:val="Hyperlink"/>
@@ -5677,10 +5728,10 @@
         <w:t xml:space="preserve">) that provides tangible value to the communities in which research or monitoring was conducted.</w:t>
       </w:r>
     </w:p>
-    <w:bookmarkEnd w:id="179"/>
     <w:bookmarkEnd w:id="180"/>
     <w:bookmarkEnd w:id="181"/>
-    <w:bookmarkStart w:id="196" w:name="X6e6a8091e64360c7c796e20e8600d9ec04d00d2"/>
+    <w:bookmarkEnd w:id="182"/>
+    <w:bookmarkStart w:id="197" w:name="X6e6a8091e64360c7c796e20e8600d9ec04d00d2"/>
     <w:p>
       <w:pPr>
         <w:pStyle w:val="Heading2"/>
@@ -5853,7 +5904,7 @@
         </w:tc>
       </w:tr>
     </w:tbl>
-    <w:bookmarkStart w:id="187" w:name="X42fd0ebf7c7ecf3543f97d009df458f5f396cc5"/>
+    <w:bookmarkStart w:id="188" w:name="X42fd0ebf7c7ecf3543f97d009df458f5f396cc5"/>
     <w:p>
       <w:pPr>
         <w:pStyle w:val="Heading3"/>
@@ -5904,7 +5955,7 @@
           <w:numId w:val="1026"/>
         </w:numPr>
       </w:pPr>
-      <w:hyperlink r:id="rId182">
+      <w:hyperlink r:id="rId183">
         <w:r>
           <w:rPr>
             <w:rStyle w:val="Hyperlink"/>
@@ -5921,7 +5972,7 @@
           <w:numId w:val="1026"/>
         </w:numPr>
       </w:pPr>
-      <w:hyperlink r:id="rId183">
+      <w:hyperlink r:id="rId184">
         <w:r>
           <w:rPr>
             <w:rStyle w:val="Hyperlink"/>
@@ -5944,7 +5995,7 @@
       <w:r>
         <w:t xml:space="preserve"> </w:t>
       </w:r>
-      <w:hyperlink r:id="rId127">
+      <w:hyperlink r:id="rId128">
         <w:r>
           <w:rPr>
             <w:rStyle w:val="Hyperlink"/>
@@ -5967,7 +6018,7 @@
       <w:r>
         <w:t xml:space="preserve"> </w:t>
       </w:r>
-      <w:hyperlink r:id="rId65">
+      <w:hyperlink r:id="rId66">
         <w:r>
           <w:rPr>
             <w:rStyle w:val="Hyperlink"/>
@@ -6000,7 +6051,7 @@
           <w:numId w:val="1027"/>
         </w:numPr>
       </w:pPr>
-      <w:hyperlink r:id="rId133">
+      <w:hyperlink r:id="rId134">
         <w:r>
           <w:rPr>
             <w:rStyle w:val="Hyperlink"/>
@@ -6017,7 +6068,7 @@
           <w:numId w:val="1027"/>
         </w:numPr>
       </w:pPr>
-      <w:hyperlink r:id="rId184">
+      <w:hyperlink r:id="rId185">
         <w:r>
           <w:rPr>
             <w:rStyle w:val="Hyperlink"/>
@@ -6050,7 +6101,7 @@
           <w:numId w:val="1028"/>
         </w:numPr>
       </w:pPr>
-      <w:hyperlink r:id="rId185">
+      <w:hyperlink r:id="rId186">
         <w:r>
           <w:rPr>
             <w:rStyle w:val="Hyperlink"/>
@@ -6067,7 +6118,7 @@
           <w:numId w:val="1028"/>
         </w:numPr>
       </w:pPr>
-      <w:hyperlink r:id="rId186">
+      <w:hyperlink r:id="rId187">
         <w:r>
           <w:rPr>
             <w:rStyle w:val="Hyperlink"/>
@@ -6102,7 +6153,7 @@
       <w:r>
         <w:t xml:space="preserve"> </w:t>
       </w:r>
-      <w:hyperlink r:id="rId46">
+      <w:hyperlink r:id="rId47">
         <w:r>
           <w:rPr>
             <w:rStyle w:val="Hyperlink"/>
@@ -6123,12 +6174,29 @@
         </w:numPr>
       </w:pPr>
       <w:r>
-        <w:t xml:space="preserve">Treat the Salmon Domain Ontology as the canonical interoperability layer, then review the</w:t>
-      </w:r>
-      <w:r>
-        <w:t xml:space="preserve"> </w:t>
-      </w:r>
-      <w:hyperlink r:id="rId47">
+        <w:t xml:space="preserve">Treat the</w:t>
+      </w:r>
+      <w:r>
+        <w:t xml:space="preserve"> </w:t>
+      </w:r>
+      <w:hyperlink r:id="rId42">
+        <w:r>
+          <w:rPr>
+            <w:rStyle w:val="Hyperlink"/>
+          </w:rPr>
+          <w:t xml:space="preserve">Salmon Domain Ontology</w:t>
+        </w:r>
+      </w:hyperlink>
+      <w:r>
+        <w:t xml:space="preserve"> </w:t>
+      </w:r>
+      <w:r>
+        <w:t xml:space="preserve">as the canonical interoperability layer, then review the</w:t>
+      </w:r>
+      <w:r>
+        <w:t xml:space="preserve"> </w:t>
+      </w:r>
+      <w:hyperlink r:id="rId48">
         <w:r>
           <w:rPr>
             <w:rStyle w:val="Hyperlink"/>
@@ -6157,7 +6225,7 @@
       <w:r>
         <w:t xml:space="preserve"> </w:t>
       </w:r>
-      <w:hyperlink r:id="rId45">
+      <w:hyperlink r:id="rId46">
         <w:r>
           <w:rPr>
             <w:rStyle w:val="Hyperlink"/>
@@ -6172,8 +6240,8 @@
         <w:t xml:space="preserve">to understand package structure and metadata expectations.</w:t>
       </w:r>
     </w:p>
-    <w:bookmarkEnd w:id="187"/>
-    <w:bookmarkStart w:id="193" w:name="Xa794745505debb5caed466e9b97aaf2000f7289"/>
+    <w:bookmarkEnd w:id="188"/>
+    <w:bookmarkStart w:id="194" w:name="Xa794745505debb5caed466e9b97aaf2000f7289"/>
     <w:p>
       <w:pPr>
         <w:pStyle w:val="Heading3"/>
@@ -6224,7 +6292,7 @@
           <w:numId w:val="1031"/>
         </w:numPr>
       </w:pPr>
-      <w:hyperlink r:id="rId188">
+      <w:hyperlink r:id="rId189">
         <w:r>
           <w:rPr>
             <w:rStyle w:val="Hyperlink"/>
@@ -6241,7 +6309,7 @@
           <w:numId w:val="1031"/>
         </w:numPr>
       </w:pPr>
-      <w:hyperlink r:id="rId189">
+      <w:hyperlink r:id="rId190">
         <w:r>
           <w:rPr>
             <w:rStyle w:val="Hyperlink"/>
@@ -6258,7 +6326,7 @@
           <w:numId w:val="1031"/>
         </w:numPr>
       </w:pPr>
-      <w:hyperlink r:id="rId151">
+      <w:hyperlink r:id="rId152">
         <w:r>
           <w:rPr>
             <w:rStyle w:val="Hyperlink"/>
@@ -6291,7 +6359,7 @@
           <w:numId w:val="1032"/>
         </w:numPr>
       </w:pPr>
-      <w:hyperlink r:id="rId190">
+      <w:hyperlink r:id="rId191">
         <w:r>
           <w:rPr>
             <w:rStyle w:val="Hyperlink"/>
@@ -6308,7 +6376,7 @@
           <w:numId w:val="1032"/>
         </w:numPr>
       </w:pPr>
-      <w:hyperlink r:id="rId172">
+      <w:hyperlink r:id="rId173">
         <w:r>
           <w:rPr>
             <w:rStyle w:val="Hyperlink"/>
@@ -6325,7 +6393,7 @@
           <w:numId w:val="1032"/>
         </w:numPr>
       </w:pPr>
-      <w:hyperlink r:id="rId144">
+      <w:hyperlink r:id="rId145">
         <w:r>
           <w:rPr>
             <w:rStyle w:val="Hyperlink"/>
@@ -6342,7 +6410,7 @@
           <w:numId w:val="1032"/>
         </w:numPr>
       </w:pPr>
-      <w:hyperlink r:id="rId191">
+      <w:hyperlink r:id="rId192">
         <w:r>
           <w:rPr>
             <w:rStyle w:val="Hyperlink"/>
@@ -6375,7 +6443,7 @@
           <w:numId w:val="1033"/>
         </w:numPr>
       </w:pPr>
-      <w:hyperlink r:id="rId147">
+      <w:hyperlink r:id="rId148">
         <w:r>
           <w:rPr>
             <w:rStyle w:val="Hyperlink"/>
@@ -6392,7 +6460,7 @@
           <w:numId w:val="1033"/>
         </w:numPr>
       </w:pPr>
-      <w:hyperlink r:id="rId159">
+      <w:hyperlink r:id="rId160">
         <w:r>
           <w:rPr>
             <w:rStyle w:val="Hyperlink"/>
@@ -6409,7 +6477,7 @@
           <w:numId w:val="1033"/>
         </w:numPr>
       </w:pPr>
-      <w:hyperlink r:id="rId160">
+      <w:hyperlink r:id="rId161">
         <w:r>
           <w:rPr>
             <w:rStyle w:val="Hyperlink"/>
@@ -6426,7 +6494,7 @@
           <w:numId w:val="1033"/>
         </w:numPr>
       </w:pPr>
-      <w:hyperlink r:id="rId192">
+      <w:hyperlink r:id="rId193">
         <w:r>
           <w:rPr>
             <w:rStyle w:val="Hyperlink"/>
@@ -6468,7 +6536,24 @@
         </w:numPr>
       </w:pPr>
       <w:r>
-        <w:t xml:space="preserve">Map at least 10 core fields to the Salmon Domain Ontology first, then use the DFO Salmon Ontology where organization-specific controlled vocabularies are needed.</w:t>
+        <w:t xml:space="preserve">Map at least 10 core fields to the</w:t>
+      </w:r>
+      <w:r>
+        <w:t xml:space="preserve"> </w:t>
+      </w:r>
+      <w:hyperlink r:id="rId42">
+        <w:r>
+          <w:rPr>
+            <w:rStyle w:val="Hyperlink"/>
+          </w:rPr>
+          <w:t xml:space="preserve">Salmon Domain Ontology</w:t>
+        </w:r>
+      </w:hyperlink>
+      <w:r>
+        <w:t xml:space="preserve"> </w:t>
+      </w:r>
+      <w:r>
+        <w:t xml:space="preserve">first, then use the DFO Salmon Ontology where organization-specific controlled vocabularies are needed.</w:t>
       </w:r>
     </w:p>
     <w:p>
@@ -6483,8 +6568,8 @@
         <w:t xml:space="preserve">Publish a release with persistent metadata and DOI-backed citation text.</w:t>
       </w:r>
     </w:p>
-    <w:bookmarkEnd w:id="193"/>
-    <w:bookmarkStart w:id="195" w:name="X5085146f5b8ad7365f66713e7e9762120c07eb4"/>
+    <w:bookmarkEnd w:id="194"/>
+    <w:bookmarkStart w:id="196" w:name="X5085146f5b8ad7365f66713e7e9762120c07eb4"/>
     <w:p>
       <w:pPr>
         <w:pStyle w:val="Heading3"/>
@@ -6535,7 +6620,7 @@
           <w:numId w:val="1036"/>
         </w:numPr>
       </w:pPr>
-      <w:hyperlink r:id="rId171">
+      <w:hyperlink r:id="rId172">
         <w:r>
           <w:rPr>
             <w:rStyle w:val="Hyperlink"/>
@@ -6552,7 +6637,7 @@
           <w:numId w:val="1036"/>
         </w:numPr>
       </w:pPr>
-      <w:hyperlink r:id="rId172">
+      <w:hyperlink r:id="rId173">
         <w:r>
           <w:rPr>
             <w:rStyle w:val="Hyperlink"/>
@@ -6585,7 +6670,7 @@
           <w:numId w:val="1037"/>
         </w:numPr>
       </w:pPr>
-      <w:hyperlink r:id="rId176">
+      <w:hyperlink r:id="rId177">
         <w:r>
           <w:rPr>
             <w:rStyle w:val="Hyperlink"/>
@@ -6602,7 +6687,7 @@
           <w:numId w:val="1037"/>
         </w:numPr>
       </w:pPr>
-      <w:hyperlink r:id="rId177">
+      <w:hyperlink r:id="rId178">
         <w:r>
           <w:rPr>
             <w:rStyle w:val="Hyperlink"/>
@@ -6646,7 +6731,7 @@
       <w:r>
         <w:t xml:space="preserve">User-centred design reference (</w:t>
       </w:r>
-      <w:hyperlink r:id="rId194">
+      <w:hyperlink r:id="rId195">
         <w:r>
           <w:rPr>
             <w:rStyle w:val="Hyperlink"/>
@@ -6702,9 +6787,9 @@
         <w:t xml:space="preserve">This progression is intended to be practical rather than prescriptive: teams can adjust pace and tooling while keeping the same capability milestones.</w:t>
       </w:r>
     </w:p>
-    <w:bookmarkEnd w:id="195"/>
     <w:bookmarkEnd w:id="196"/>
-    <w:bookmarkStart w:id="227" w:name="appendix-3-getting-started-checklist"/>
+    <w:bookmarkEnd w:id="197"/>
+    <w:bookmarkStart w:id="228" w:name="appendix-3-getting-started-checklist"/>
     <w:p>
       <w:pPr>
         <w:pStyle w:val="Heading2"/>
@@ -6729,7 +6814,7 @@
         <w:t xml:space="preserve">Tip: For each item, capture a link to the living source (e.g., repository, shared drive, policy page) and the responsible owner.</w:t>
       </w:r>
     </w:p>
-    <w:bookmarkStart w:id="200" w:name="practice-1-make-data-governance-explicit"/>
+    <w:bookmarkStart w:id="201" w:name="practice-1-make-data-governance-explicit"/>
     <w:p>
       <w:pPr>
         <w:pStyle w:val="Heading3"/>
@@ -6738,7 +6823,7 @@
         <w:t xml:space="preserve">Practice 1 — Make Data Governance Explicit</w:t>
       </w:r>
     </w:p>
-    <w:bookmarkStart w:id="197" w:name="project"/>
+    <w:bookmarkStart w:id="198" w:name="project"/>
     <w:p>
       <w:pPr>
         <w:pStyle w:val="Heading4"/>
@@ -6794,8 +6879,8 @@
         <w:t xml:space="preserve">- [ ] Is a data product charter written for each dataset or analysis product with purpose, audience, quality thresholds, release plan?</w:t>
       </w:r>
     </w:p>
-    <w:bookmarkEnd w:id="197"/>
-    <w:bookmarkStart w:id="198" w:name="program"/>
+    <w:bookmarkEnd w:id="198"/>
+    <w:bookmarkStart w:id="199" w:name="program"/>
     <w:p>
       <w:pPr>
         <w:pStyle w:val="Heading4"/>
@@ -6842,8 +6927,8 @@
         <w:t xml:space="preserve">- [ ] Are data sharing agreements/MOUs and ethical review pathways documented and reusable?</w:t>
       </w:r>
     </w:p>
-    <w:bookmarkEnd w:id="198"/>
-    <w:bookmarkStart w:id="199" w:name="organization"/>
+    <w:bookmarkEnd w:id="199"/>
+    <w:bookmarkStart w:id="200" w:name="organization"/>
     <w:p>
       <w:pPr>
         <w:pStyle w:val="Heading4"/>
@@ -6880,9 +6965,9 @@
         <w:t xml:space="preserve">Evidence to collect: DMP link, data product charter(s), RACI, IDS guidance, sharing agreements registry.</w:t>
       </w:r>
     </w:p>
-    <w:bookmarkEnd w:id="199"/>
     <w:bookmarkEnd w:id="200"/>
-    <w:bookmarkStart w:id="204" w:name="practice-2-reuse-proven-infrastructure"/>
+    <w:bookmarkEnd w:id="201"/>
+    <w:bookmarkStart w:id="205" w:name="practice-2-reuse-proven-infrastructure"/>
     <w:p>
       <w:pPr>
         <w:pStyle w:val="Heading3"/>
@@ -6891,7 +6976,7 @@
         <w:t xml:space="preserve">Practice 2 — Reuse Proven Infrastructure</w:t>
       </w:r>
     </w:p>
-    <w:bookmarkStart w:id="201" w:name="project-1"/>
+    <w:bookmarkStart w:id="202" w:name="project-1"/>
     <w:p>
       <w:pPr>
         <w:pStyle w:val="Heading4"/>
@@ -6938,8 +7023,8 @@
         <w:t xml:space="preserve">- [ ] Do you use existing organization authentication/authorization and backup processes?</w:t>
       </w:r>
     </w:p>
-    <w:bookmarkEnd w:id="201"/>
-    <w:bookmarkStart w:id="202" w:name="program-1"/>
+    <w:bookmarkEnd w:id="202"/>
+    <w:bookmarkStart w:id="203" w:name="program-1"/>
     <w:p>
       <w:pPr>
         <w:pStyle w:val="Heading4"/>
@@ -6968,8 +7053,8 @@
         <w:t xml:space="preserve">- [ ] Do projects consistently deposit finalized data in approved repositories with clear intake criteria?</w:t>
       </w:r>
     </w:p>
-    <w:bookmarkEnd w:id="202"/>
-    <w:bookmarkStart w:id="203" w:name="organization-1"/>
+    <w:bookmarkEnd w:id="203"/>
+    <w:bookmarkStart w:id="204" w:name="organization-1"/>
     <w:p>
       <w:pPr>
         <w:pStyle w:val="Heading4"/>
@@ -7006,9 +7091,9 @@
         <w:t xml:space="preserve">Evidence to collect: repository URLs, infrastructure inventory, intake criteria, backup/DR documentation.</w:t>
       </w:r>
     </w:p>
-    <w:bookmarkEnd w:id="203"/>
     <w:bookmarkEnd w:id="204"/>
-    <w:bookmarkStart w:id="208" w:name="Xd5ee02bc2d4148b1f0172bd1728e238823753c5"/>
+    <w:bookmarkEnd w:id="205"/>
+    <w:bookmarkStart w:id="209" w:name="Xd5ee02bc2d4148b1f0172bd1728e238823753c5"/>
     <w:p>
       <w:pPr>
         <w:pStyle w:val="Heading3"/>
@@ -7017,7 +7102,7 @@
         <w:t xml:space="preserve">Practice 3 — Use Persistent Identifiers (PIDs) for People, Projects, Data, and Methods</w:t>
       </w:r>
     </w:p>
-    <w:bookmarkStart w:id="205" w:name="project-2"/>
+    <w:bookmarkStart w:id="206" w:name="project-2"/>
     <w:p>
       <w:pPr>
         <w:pStyle w:val="Heading4"/>
@@ -7064,8 +7149,8 @@
         <w:t xml:space="preserve">- [ ] Are methods/protocols published and citable (e.g., protocol DOI) and linked from dataset metadata?</w:t>
       </w:r>
     </w:p>
-    <w:bookmarkEnd w:id="205"/>
-    <w:bookmarkStart w:id="206" w:name="program-2"/>
+    <w:bookmarkEnd w:id="206"/>
+    <w:bookmarkStart w:id="207" w:name="program-2"/>
     <w:p>
       <w:pPr>
         <w:pStyle w:val="Heading4"/>
@@ -7094,8 +7179,8 @@
         <w:t xml:space="preserve">- [ ] Are projects linked to organizational identifiers (e.g., ROR for institutions) in metadata?</w:t>
       </w:r>
     </w:p>
-    <w:bookmarkEnd w:id="206"/>
-    <w:bookmarkStart w:id="207" w:name="organization-2"/>
+    <w:bookmarkEnd w:id="207"/>
+    <w:bookmarkStart w:id="208" w:name="organization-2"/>
     <w:p>
       <w:pPr>
         <w:pStyle w:val="Heading4"/>
@@ -7132,9 +7217,9 @@
         <w:t xml:space="preserve">Evidence to collect: ORCID list, PID policy, DOI records, resolver links in the catalog.</w:t>
       </w:r>
     </w:p>
-    <w:bookmarkEnd w:id="207"/>
     <w:bookmarkEnd w:id="208"/>
-    <w:bookmarkStart w:id="212" w:name="Xf9fd600ab9a6d62c48506102a263b71f9becf16"/>
+    <w:bookmarkEnd w:id="209"/>
+    <w:bookmarkStart w:id="213" w:name="Xf9fd600ab9a6d62c48506102a263b71f9becf16"/>
     <w:p>
       <w:pPr>
         <w:pStyle w:val="Heading3"/>
@@ -7143,7 +7228,7 @@
         <w:t xml:space="preserve">Practice 4 — Shared Data Models, Vocabularies, and Metadata</w:t>
       </w:r>
     </w:p>
-    <w:bookmarkStart w:id="209" w:name="project-3"/>
+    <w:bookmarkStart w:id="210" w:name="project-3"/>
     <w:p>
       <w:pPr>
         <w:pStyle w:val="Heading4"/>
@@ -7190,8 +7275,8 @@
         <w:t xml:space="preserve">- [ ] Is a data dictionary included with definitions, units, allowed values, and provenance for each variable?</w:t>
       </w:r>
     </w:p>
-    <w:bookmarkEnd w:id="209"/>
-    <w:bookmarkStart w:id="210" w:name="program-3"/>
+    <w:bookmarkEnd w:id="210"/>
+    <w:bookmarkStart w:id="211" w:name="program-3"/>
     <w:p>
       <w:pPr>
         <w:pStyle w:val="Heading4"/>
@@ -7220,8 +7305,8 @@
         <w:t xml:space="preserve">- [ ] Are validation checks in CI (schema validation, vocab checks) standardized across repositories?</w:t>
       </w:r>
     </w:p>
-    <w:bookmarkEnd w:id="210"/>
-    <w:bookmarkStart w:id="211" w:name="organization-3"/>
+    <w:bookmarkEnd w:id="211"/>
+    <w:bookmarkStart w:id="212" w:name="organization-3"/>
     <w:p>
       <w:pPr>
         <w:pStyle w:val="Heading4"/>
@@ -7258,9 +7343,9 @@
         <w:t xml:space="preserve">Evidence to collect: metadata profiles, data dictionary, code lists, schema validators, mapping documentation.</w:t>
       </w:r>
     </w:p>
-    <w:bookmarkEnd w:id="211"/>
     <w:bookmarkEnd w:id="212"/>
-    <w:bookmarkStart w:id="216" w:name="X1953933a9a9dcdc8d482995d59b75af7f7e8d2c"/>
+    <w:bookmarkEnd w:id="213"/>
+    <w:bookmarkStart w:id="217" w:name="X1953933a9a9dcdc8d482995d59b75af7f7e8d2c"/>
     <w:p>
       <w:pPr>
         <w:pStyle w:val="Heading3"/>
@@ -7269,7 +7354,7 @@
         <w:t xml:space="preserve">Practice 5 — Store and Analyze Data for Easy Access, Use, and Trust</w:t>
       </w:r>
     </w:p>
-    <w:bookmarkStart w:id="213" w:name="project-4"/>
+    <w:bookmarkStart w:id="214" w:name="project-4"/>
     <w:p>
       <w:pPr>
         <w:pStyle w:val="Heading4"/>
@@ -7325,8 +7410,8 @@
         <w:t xml:space="preserve">- [ ] Are access controls and sensitive data handling documented and implemented?</w:t>
       </w:r>
     </w:p>
-    <w:bookmarkEnd w:id="213"/>
-    <w:bookmarkStart w:id="214" w:name="program-4"/>
+    <w:bookmarkEnd w:id="214"/>
+    <w:bookmarkStart w:id="215" w:name="program-4"/>
     <w:p>
       <w:pPr>
         <w:pStyle w:val="Heading4"/>
@@ -7355,8 +7440,8 @@
         <w:t xml:space="preserve">- [ ] Are standard storage classes, lifecycle policies, and archival rules applied?</w:t>
       </w:r>
     </w:p>
-    <w:bookmarkEnd w:id="214"/>
-    <w:bookmarkStart w:id="215" w:name="organization-4"/>
+    <w:bookmarkEnd w:id="215"/>
+    <w:bookmarkStart w:id="216" w:name="organization-4"/>
     <w:p>
       <w:pPr>
         <w:pStyle w:val="Heading4"/>
@@ -7393,9 +7478,9 @@
         <w:t xml:space="preserve">Evidence to collect: workflow definition, environment files, container references, QA/QC reports, storage/backup settings.</w:t>
       </w:r>
     </w:p>
-    <w:bookmarkEnd w:id="215"/>
     <w:bookmarkEnd w:id="216"/>
-    <w:bookmarkStart w:id="220" w:name="X09eeb7331e7661c0e600debc39b8121143e6e9d"/>
+    <w:bookmarkEnd w:id="217"/>
+    <w:bookmarkStart w:id="221" w:name="X09eeb7331e7661c0e600debc39b8121143e6e9d"/>
     <w:p>
       <w:pPr>
         <w:pStyle w:val="Heading3"/>
@@ -7404,7 +7489,7 @@
         <w:t xml:space="preserve">Practice 6 — Incentivize and Track Sharing and Reuse</w:t>
       </w:r>
     </w:p>
-    <w:bookmarkStart w:id="217" w:name="project-5"/>
+    <w:bookmarkStart w:id="218" w:name="project-5"/>
     <w:p>
       <w:pPr>
         <w:pStyle w:val="Heading4"/>
@@ -7442,8 +7527,8 @@
         <w:t xml:space="preserve">- [ ] Do release notes document what changed and implications for users?</w:t>
       </w:r>
     </w:p>
-    <w:bookmarkEnd w:id="217"/>
-    <w:bookmarkStart w:id="218" w:name="program-5"/>
+    <w:bookmarkEnd w:id="218"/>
+    <w:bookmarkStart w:id="219" w:name="program-5"/>
     <w:p>
       <w:pPr>
         <w:pStyle w:val="Heading4"/>
@@ -7472,8 +7557,8 @@
         <w:t xml:space="preserve">- [ ] Are data citations tracked in assessments, reports, and staff evaluations?</w:t>
       </w:r>
     </w:p>
-    <w:bookmarkEnd w:id="218"/>
-    <w:bookmarkStart w:id="219" w:name="organization-5"/>
+    <w:bookmarkEnd w:id="219"/>
+    <w:bookmarkStart w:id="220" w:name="organization-5"/>
     <w:p>
       <w:pPr>
         <w:pStyle w:val="Heading4"/>
@@ -7510,9 +7595,9 @@
         <w:t xml:space="preserve">Evidence to collect: LICENSE, CITATION, reuse dashboard link, policy excerpts, sample citations in reports.</w:t>
       </w:r>
     </w:p>
-    <w:bookmarkEnd w:id="219"/>
     <w:bookmarkEnd w:id="220"/>
-    <w:bookmarkStart w:id="224" w:name="Xf1ef7e3eb857b993ceb364de2f4e82691aed878"/>
+    <w:bookmarkEnd w:id="221"/>
+    <w:bookmarkStart w:id="225" w:name="Xf1ef7e3eb857b993ceb364de2f4e82691aed878"/>
     <w:p>
       <w:pPr>
         <w:pStyle w:val="Heading3"/>
@@ -7521,7 +7606,7 @@
         <w:t xml:space="preserve">Practice 7 — Build Community Through Co‑Development and Mutual Benefit</w:t>
       </w:r>
     </w:p>
-    <w:bookmarkStart w:id="221" w:name="project-6"/>
+    <w:bookmarkStart w:id="222" w:name="project-6"/>
     <w:p>
       <w:pPr>
         <w:pStyle w:val="Heading4"/>
@@ -7559,8 +7644,8 @@
         <w:t xml:space="preserve">- [ ] Is there an open feedback channel (issues form, contact) and a published roadmap?</w:t>
       </w:r>
     </w:p>
-    <w:bookmarkEnd w:id="221"/>
-    <w:bookmarkStart w:id="222" w:name="program-6"/>
+    <w:bookmarkEnd w:id="222"/>
+    <w:bookmarkStart w:id="223" w:name="program-6"/>
     <w:p>
       <w:pPr>
         <w:pStyle w:val="Heading4"/>
@@ -7589,8 +7674,8 @@
         <w:t xml:space="preserve">- [ ] Are community contributions recognized (authorship, acknowledgements, meeting time, funding)?</w:t>
       </w:r>
     </w:p>
-    <w:bookmarkEnd w:id="222"/>
-    <w:bookmarkStart w:id="223" w:name="organization-6"/>
+    <w:bookmarkEnd w:id="223"/>
+    <w:bookmarkStart w:id="224" w:name="organization-6"/>
     <w:p>
       <w:pPr>
         <w:pStyle w:val="Heading4"/>
@@ -7634,9 +7719,9 @@
         </w:pict>
       </w:r>
     </w:p>
-    <w:bookmarkEnd w:id="223"/>
     <w:bookmarkEnd w:id="224"/>
-    <w:bookmarkStart w:id="225" w:name="quick-start-306090day-plan"/>
+    <w:bookmarkEnd w:id="225"/>
+    <w:bookmarkStart w:id="226" w:name="quick-start-306090day-plan"/>
     <w:p>
       <w:pPr>
         <w:pStyle w:val="Heading3"/>
@@ -7796,8 +7881,8 @@
         </w:pict>
       </w:r>
     </w:p>
-    <w:bookmarkEnd w:id="225"/>
-    <w:bookmarkStart w:id="226" w:name="X5baba2ffe9b3bc899417ced2108067196c8d8e9"/>
+    <w:bookmarkEnd w:id="226"/>
+    <w:bookmarkStart w:id="227" w:name="X5baba2ffe9b3bc899417ced2108067196c8d8e9"/>
     <w:p>
       <w:pPr>
         <w:pStyle w:val="Heading3"/>
@@ -7922,9 +8007,9 @@
         <w:t xml:space="preserve">Maintain this list as a living issue in your repository and review quarterly.</w:t>
       </w:r>
     </w:p>
-    <w:bookmarkEnd w:id="226"/>
     <w:bookmarkEnd w:id="227"/>
     <w:bookmarkEnd w:id="228"/>
+    <w:bookmarkEnd w:id="229"/>
     <w:sectPr>
       <w:footnotePr>
         <w:numRestart w:val="eachSect"/>

</xml_diff>

<commit_message>
Restore abstract to pre-c09fde2 wording
</commit_message>
<xml_diff>
--- a/docs/index.docx
+++ b/docs/index.docx
@@ -31,16 +31,7 @@
         <w:pStyle w:val="Abstract"/>
       </w:pPr>
       <w:r>
-        <w:t xml:space="preserve">Fisheries management and salmon conservation depend on integrating diverse datasets collected across jurisdictions, disciplines, and life-history stages. In practice, these data are often fragmented, inconsistently documented, and difficult to reuse, making synthesis and routine updates costly. Data stewardship—the social and technical work of documenting, governing, standardizing, and publishing data products—can reduce these barriers when supported by clear roles, shared practices, and fit-for-purpose infrastructure. We present seven practices for salmon data stewardship, grounded in FAIR and CARE principles, and illustrate them with a cross-jurisdictional sockeye productivity synthesis case study spanning Washington, British Columbia, and Alaska</w:t>
-      </w:r>
-      <w:r>
-        <w:t xml:space="preserve"> </w:t>
-      </w:r>
-      <w:r>
-        <w:t xml:space="preserve">(Peterman &amp; Dorner, 2012)</w:t>
-      </w:r>
-      <w:r>
-        <w:t xml:space="preserve">. We provide practical guidance and examples for biologists taking on stewardship responsibilities, including a brief worked example (SDIS) showing how the practices can be implemented as an end-to-end, versioned workflow. While motivated by salmon, the practices are intended to be transferable to other data-rich fisheries domains.</w:t>
+        <w:t xml:space="preserve">Fisheries management, research, and broader conservation efforts increasingly generate vast, diverse datasets needed for timely decision-making. Yet these data remain fragmented across jurisdictions, disciplines, and legacy infrastructure, limiting responsive management. The lack of access, interoperability, and reuse of data are major impediments to better science; data stewardship—the set of social and technical practices that ensure data are responsibly created, managed, shared, and reused over time—is the solution. Biologists are increasingly taking on data stewardship responsibilities to address these challenges, often without clear guidance, training, or support. Shared, community-agreed practices for implementing domain-specific data standards are needed to move beyond generic data management guidance toward fit-for-purpose tools and workflows. To address this gap—and to show how other communities can do so—we develop seven practices for salmon data stewardship. Through a case study of a historically important sockeye salmon Oncorhynchus nerka productivity analysis that spanned Pacific Coast jurisdictions, we highlight how clearly defined data stewardship practices could improve data integration, management efficacy, and reduce the overall cost of updating the analysis annually. We provide practical guidance for those transitioning into these essential stewardship roles, including salmon domain specific data tools, templates, and examples. These practices integrate both sociocultural and technical approaches to ensure data meet modern open science principles and respect Indigenous Data Sovereignty. With a foundation of shared practices, data stewards will enable faster, more transparent decision-making. They will expand the reuse of cross-jurisdictional datasets and support machine-actionable data with high-quality metadata and consistent semantics. Together, these outcomes strengthen the management and conservation of salmon populations and the ecosystems they inhabit, with broader relevance to other data-rich fisheries domains.</w:t>
       </w:r>
     </w:p>
     <w:bookmarkStart w:id="31" w:name="the-data-stewardship-challenge"/>

</xml_diff>